<commit_message>
Add horoscope quick reference table and new PDF file
</commit_message>
<xml_diff>
--- a/exp 1/exp 1.docx
+++ b/exp 1/exp 1.docx
@@ -229,6 +229,12 @@
                 <w:sz w:val="26"/>
               </w:rPr>
             </w:pPr>
+            <w:r>
+              <w:rPr>
+                <w:sz w:val="26"/>
+              </w:rPr>
+              <w:t xml:space="preserve">                                14.07.2026</w:t>
+            </w:r>
           </w:p>
           <w:p>
             <w:pPr>
@@ -292,6 +298,18 @@
                 <w:sz w:val="26"/>
               </w:rPr>
             </w:pPr>
+            <w:r>
+              <w:rPr>
+                <w:sz w:val="26"/>
+              </w:rPr>
+              <w:t xml:space="preserve">    </w:t>
+            </w:r>
+            <w:r>
+              <w:rPr>
+                <w:sz w:val="26"/>
+              </w:rPr>
+              <w:t>https://github.com/adhishm-0/web-technology-lab/tree/73c7cdd7a590feacd5618668158acbaaed2049ac/exp%201</w:t>
+            </w:r>
           </w:p>
         </w:tc>
       </w:tr>
@@ -328,21 +346,12 @@
     </w:p>
     <w:p>
       <w:r>
-        <w:t xml:space="preserve">        </w:t>
-      </w:r>
-      <w:r>
-        <w:t xml:space="preserve">To design and develop a simple yet structured HTML5-based website using various essential HTML5 tags </w:t>
-      </w:r>
-      <w:r>
-        <w:t xml:space="preserve"> </w:t>
-      </w:r>
-    </w:p>
-    <w:p>
-      <w:r>
-        <w:t xml:space="preserve">        </w:t>
-      </w:r>
-      <w:r>
-        <w:t>and features that demonstrate a clear understanding of semantic elements and formatting techniques.</w:t>
+        <w:t xml:space="preserve">        To design and develop a simple yet structured HTML5-based website using various essential HTML5 tags  </w:t>
+      </w:r>
+    </w:p>
+    <w:p>
+      <w:r>
+        <w:t xml:space="preserve">        and features that demonstrate a clear understanding of semantic elements and formatting techniques.</w:t>
       </w:r>
     </w:p>
     <w:p>
@@ -373,18 +382,7 @@
         <w:jc w:val="both"/>
       </w:pPr>
       <w:r>
-        <w:t xml:space="preserve">        </w:t>
-      </w:r>
-      <w:r>
-        <w:t>This exercise involves creating a simple HTML5 website named '</w:t>
-      </w:r>
-      <w:proofErr w:type="spellStart"/>
-      <w:r>
-        <w:t>StarVerse</w:t>
-      </w:r>
-      <w:proofErr w:type="spellEnd"/>
-      <w:r>
-        <w:t xml:space="preserve">'. The website consists of two </w:t>
+        <w:t xml:space="preserve">        This exercise involves creating a simple HTML5 website named 'StarVerse'. The website consists of two </w:t>
       </w:r>
     </w:p>
     <w:p>
@@ -392,10 +390,7 @@
         <w:jc w:val="both"/>
       </w:pPr>
       <w:r>
-        <w:t xml:space="preserve">         </w:t>
-      </w:r>
-      <w:r>
-        <w:t xml:space="preserve">web pages: Home and Today's Horoscope. It demonstrates the use of HTML5 semantic elements, headings, </w:t>
+        <w:t xml:space="preserve">         web pages: Home and Today's Horoscope. It demonstrates the use of HTML5 semantic elements, headings, </w:t>
       </w:r>
     </w:p>
     <w:p>
@@ -403,10 +398,7 @@
         <w:jc w:val="both"/>
       </w:pPr>
       <w:r>
-        <w:t xml:space="preserve">         </w:t>
-      </w:r>
-      <w:r>
-        <w:t xml:space="preserve">paragraphs, hyperlinks, tables, lists, CSS styling, and navigation links. The website follows proper </w:t>
+        <w:t xml:space="preserve">         paragraphs, hyperlinks, tables, lists, CSS styling, and navigation links. The website follows proper </w:t>
       </w:r>
     </w:p>
     <w:p>
@@ -414,10 +406,7 @@
         <w:jc w:val="both"/>
       </w:pPr>
       <w:r>
-        <w:t xml:space="preserve">         </w:t>
-      </w:r>
-      <w:r>
-        <w:t>formatting and uses suitable background and text colors to provide a clean and user-friendly interface.</w:t>
+        <w:t xml:space="preserve">         formatting and uses suitable background and text colors to provide a clean and user-friendly interface.</w:t>
       </w:r>
     </w:p>
     <w:p>
@@ -537,13 +526,7 @@
         <w:rPr>
           <w:spacing w:val="-2"/>
         </w:rPr>
-        <w:t>P</w:t>
-      </w:r>
-      <w:r>
-        <w:rPr>
-          <w:spacing w:val="-2"/>
-        </w:rPr>
-        <w:t>rogram</w:t>
+        <w:t>Program</w:t>
       </w:r>
     </w:p>
     <w:p>
@@ -608,29 +591,7 @@
           <w:sz w:val="22"/>
           <w:szCs w:val="22"/>
         </w:rPr>
-        <w:t>&lt;html lang="</w:t>
-      </w:r>
-      <w:proofErr w:type="spellStart"/>
-      <w:r>
-        <w:rPr>
-          <w:b w:val="0"/>
-          <w:bCs w:val="0"/>
-          <w:spacing w:val="-2"/>
-          <w:sz w:val="22"/>
-          <w:szCs w:val="22"/>
-        </w:rPr>
-        <w:t>en</w:t>
-      </w:r>
-      <w:proofErr w:type="spellEnd"/>
-      <w:r>
-        <w:rPr>
-          <w:b w:val="0"/>
-          <w:bCs w:val="0"/>
-          <w:spacing w:val="-2"/>
-          <w:sz w:val="22"/>
-          <w:szCs w:val="22"/>
-        </w:rPr>
-        <w:t>"&gt;</w:t>
+        <w:t>&lt;html lang="en"&gt;</w:t>
       </w:r>
     </w:p>
     <w:p>
@@ -722,29 +683,7 @@
           <w:sz w:val="22"/>
           <w:szCs w:val="22"/>
         </w:rPr>
-        <w:t xml:space="preserve">    &lt;title&gt;Today's Horoscope - </w:t>
-      </w:r>
-      <w:proofErr w:type="spellStart"/>
-      <w:r>
-        <w:rPr>
-          <w:b w:val="0"/>
-          <w:bCs w:val="0"/>
-          <w:spacing w:val="-2"/>
-          <w:sz w:val="22"/>
-          <w:szCs w:val="22"/>
-        </w:rPr>
-        <w:t>StarVerse</w:t>
-      </w:r>
-      <w:proofErr w:type="spellEnd"/>
-      <w:r>
-        <w:rPr>
-          <w:b w:val="0"/>
-          <w:bCs w:val="0"/>
-          <w:spacing w:val="-2"/>
-          <w:sz w:val="22"/>
-          <w:szCs w:val="22"/>
-        </w:rPr>
-        <w:t>&lt;/title&gt;</w:t>
+        <w:t xml:space="preserve">    &lt;title&gt;Today's Horoscope - StarVerse&lt;/title&gt;</w:t>
       </w:r>
     </w:p>
     <w:p>
@@ -1380,20 +1319,8 @@
           <w:sz w:val="22"/>
           <w:szCs w:val="22"/>
         </w:rPr>
-        <w:t xml:space="preserve">            color: </w:t>
-      </w:r>
-      <w:proofErr w:type="gramStart"/>
-      <w:r>
-        <w:rPr>
-          <w:b w:val="0"/>
-          <w:bCs w:val="0"/>
-          <w:spacing w:val="-2"/>
-          <w:sz w:val="22"/>
-          <w:szCs w:val="22"/>
-        </w:rPr>
-        <w:t>white;     }</w:t>
-      </w:r>
-      <w:proofErr w:type="gramEnd"/>
+        <w:t xml:space="preserve">            color: white;     }</w:t>
+      </w:r>
     </w:p>
     <w:p>
       <w:pPr>
@@ -2364,29 +2291,7 @@
           <w:sz w:val="22"/>
           <w:szCs w:val="22"/>
         </w:rPr>
-        <w:t xml:space="preserve">        nav </w:t>
-      </w:r>
-      <w:proofErr w:type="gramStart"/>
-      <w:r>
-        <w:rPr>
-          <w:b w:val="0"/>
-          <w:bCs w:val="0"/>
-          <w:spacing w:val="-2"/>
-          <w:sz w:val="22"/>
-          <w:szCs w:val="22"/>
-        </w:rPr>
-        <w:t>a:hover</w:t>
-      </w:r>
-      <w:proofErr w:type="gramEnd"/>
-      <w:r>
-        <w:rPr>
-          <w:b w:val="0"/>
-          <w:bCs w:val="0"/>
-          <w:spacing w:val="-2"/>
-          <w:sz w:val="22"/>
-          <w:szCs w:val="22"/>
-        </w:rPr>
-        <w:t xml:space="preserve"> {</w:t>
+        <w:t xml:space="preserve">        nav a:hover {</w:t>
       </w:r>
     </w:p>
     <w:p>
@@ -2524,20 +2429,8 @@
           <w:sz w:val="22"/>
           <w:szCs w:val="22"/>
         </w:rPr>
-        <w:t xml:space="preserve">            line-height: 1.6</w:t>
-      </w:r>
-      <w:proofErr w:type="gramStart"/>
-      <w:r>
-        <w:rPr>
-          <w:b w:val="0"/>
-          <w:bCs w:val="0"/>
-          <w:spacing w:val="-2"/>
-          <w:sz w:val="22"/>
-          <w:szCs w:val="22"/>
-        </w:rPr>
-        <w:t>; }</w:t>
-      </w:r>
-      <w:proofErr w:type="gramEnd"/>
+        <w:t xml:space="preserve">            line-height: 1.6; }</w:t>
+      </w:r>
     </w:p>
     <w:p>
       <w:pPr>
@@ -2904,29 +2797,7 @@
           <w:sz w:val="22"/>
           <w:szCs w:val="22"/>
         </w:rPr>
-        <w:t xml:space="preserve">        &lt;h1&gt;</w:t>
-      </w:r>
-      <w:proofErr w:type="spellStart"/>
-      <w:r>
-        <w:rPr>
-          <w:b w:val="0"/>
-          <w:bCs w:val="0"/>
-          <w:spacing w:val="-2"/>
-          <w:sz w:val="22"/>
-          <w:szCs w:val="22"/>
-        </w:rPr>
-        <w:t>StarVerse</w:t>
-      </w:r>
-      <w:proofErr w:type="spellEnd"/>
-      <w:r>
-        <w:rPr>
-          <w:b w:val="0"/>
-          <w:bCs w:val="0"/>
-          <w:spacing w:val="-2"/>
-          <w:sz w:val="22"/>
-          <w:szCs w:val="22"/>
-        </w:rPr>
-        <w:t>&lt;/h1&gt;</w:t>
+        <w:t xml:space="preserve">        &lt;h1&gt;StarVerse&lt;/h1&gt;</w:t>
       </w:r>
     </w:p>
     <w:p>
@@ -3018,74 +2889,30 @@
           <w:sz w:val="22"/>
           <w:szCs w:val="22"/>
         </w:rPr>
-        <w:t xml:space="preserve">        &lt;a </w:t>
-      </w:r>
-      <w:proofErr w:type="spellStart"/>
-      <w:r>
-        <w:rPr>
-          <w:b w:val="0"/>
-          <w:bCs w:val="0"/>
-          <w:spacing w:val="-2"/>
-          <w:sz w:val="22"/>
-          <w:szCs w:val="22"/>
-        </w:rPr>
-        <w:t>href</w:t>
-      </w:r>
-      <w:proofErr w:type="spellEnd"/>
-      <w:r>
-        <w:rPr>
-          <w:b w:val="0"/>
-          <w:bCs w:val="0"/>
-          <w:spacing w:val="-2"/>
-          <w:sz w:val="22"/>
-          <w:szCs w:val="22"/>
-        </w:rPr>
-        <w:t>="index.html"&gt;Home&lt;/a&gt;</w:t>
-      </w:r>
-    </w:p>
-    <w:p>
-      <w:pPr>
-        <w:pStyle w:val="Heading1"/>
-        <w:spacing w:before="242"/>
-        <w:rPr>
-          <w:b w:val="0"/>
-          <w:bCs w:val="0"/>
-          <w:spacing w:val="-2"/>
-          <w:sz w:val="22"/>
-          <w:szCs w:val="22"/>
-        </w:rPr>
-      </w:pPr>
-      <w:r>
-        <w:rPr>
-          <w:b w:val="0"/>
-          <w:bCs w:val="0"/>
-          <w:spacing w:val="-2"/>
-          <w:sz w:val="22"/>
-          <w:szCs w:val="22"/>
-        </w:rPr>
-        <w:t xml:space="preserve">        &lt;a </w:t>
-      </w:r>
-      <w:proofErr w:type="spellStart"/>
-      <w:r>
-        <w:rPr>
-          <w:b w:val="0"/>
-          <w:bCs w:val="0"/>
-          <w:spacing w:val="-2"/>
-          <w:sz w:val="22"/>
-          <w:szCs w:val="22"/>
-        </w:rPr>
-        <w:t>href</w:t>
-      </w:r>
-      <w:proofErr w:type="spellEnd"/>
-      <w:r>
-        <w:rPr>
-          <w:b w:val="0"/>
-          <w:bCs w:val="0"/>
-          <w:spacing w:val="-2"/>
-          <w:sz w:val="22"/>
-          <w:szCs w:val="22"/>
-        </w:rPr>
-        <w:t>="horoscope.html"&gt;Today's Horoscope&lt;/a&gt;</w:t>
+        <w:t xml:space="preserve">        &lt;a href="index.html"&gt;Home&lt;/a&gt;</w:t>
+      </w:r>
+    </w:p>
+    <w:p>
+      <w:pPr>
+        <w:pStyle w:val="Heading1"/>
+        <w:spacing w:before="242"/>
+        <w:rPr>
+          <w:b w:val="0"/>
+          <w:bCs w:val="0"/>
+          <w:spacing w:val="-2"/>
+          <w:sz w:val="22"/>
+          <w:szCs w:val="22"/>
+        </w:rPr>
+      </w:pPr>
+      <w:r>
+        <w:rPr>
+          <w:b w:val="0"/>
+          <w:bCs w:val="0"/>
+          <w:spacing w:val="-2"/>
+          <w:sz w:val="22"/>
+          <w:szCs w:val="22"/>
+        </w:rPr>
+        <w:t xml:space="preserve">        &lt;a href="horoscope.html"&gt;Today's Horoscope&lt;/a&gt;</w:t>
       </w:r>
     </w:p>
     <w:p>
@@ -3190,29 +3017,7 @@
           <w:sz w:val="22"/>
           <w:szCs w:val="22"/>
         </w:rPr>
-        <w:t xml:space="preserve">        &lt;p&gt;Get your personalized horoscope reading for today. Find your zodiac sign and see what the stars have in store for </w:t>
-      </w:r>
-      <w:proofErr w:type="gramStart"/>
-      <w:r>
-        <w:rPr>
-          <w:b w:val="0"/>
-          <w:bCs w:val="0"/>
-          <w:spacing w:val="-2"/>
-          <w:sz w:val="22"/>
-          <w:szCs w:val="22"/>
-        </w:rPr>
-        <w:t>you!&lt;</w:t>
-      </w:r>
-      <w:proofErr w:type="gramEnd"/>
-      <w:r>
-        <w:rPr>
-          <w:b w:val="0"/>
-          <w:bCs w:val="0"/>
-          <w:spacing w:val="-2"/>
-          <w:sz w:val="22"/>
-          <w:szCs w:val="22"/>
-        </w:rPr>
-        <w:t>/p&gt;</w:t>
+        <w:t xml:space="preserve">        &lt;p&gt;Get your personalized horoscope reading for today. Find your zodiac sign and see what the stars have in store for you!&lt;/p&gt;</w:t>
       </w:r>
     </w:p>
     <w:p>
@@ -3294,74 +3099,30 @@
           <w:sz w:val="22"/>
           <w:szCs w:val="22"/>
         </w:rPr>
-        <w:t xml:space="preserve">        &lt;h3&gt;Aries (Mar 21 - Apr </w:t>
-      </w:r>
-      <w:proofErr w:type="gramStart"/>
-      <w:r>
-        <w:rPr>
-          <w:b w:val="0"/>
-          <w:bCs w:val="0"/>
-          <w:spacing w:val="-2"/>
-          <w:sz w:val="22"/>
-          <w:szCs w:val="22"/>
-        </w:rPr>
-        <w:t>19)&lt;</w:t>
-      </w:r>
-      <w:proofErr w:type="gramEnd"/>
-      <w:r>
-        <w:rPr>
-          <w:b w:val="0"/>
-          <w:bCs w:val="0"/>
-          <w:spacing w:val="-2"/>
-          <w:sz w:val="22"/>
-          <w:szCs w:val="22"/>
-        </w:rPr>
-        <w:t>/h3&gt;</w:t>
-      </w:r>
-    </w:p>
-    <w:p>
-      <w:pPr>
-        <w:pStyle w:val="Heading1"/>
-        <w:spacing w:before="242"/>
-        <w:rPr>
-          <w:b w:val="0"/>
-          <w:bCs w:val="0"/>
-          <w:spacing w:val="-2"/>
-          <w:sz w:val="22"/>
-          <w:szCs w:val="22"/>
-        </w:rPr>
-      </w:pPr>
-      <w:r>
-        <w:rPr>
-          <w:b w:val="0"/>
-          <w:bCs w:val="0"/>
-          <w:spacing w:val="-2"/>
-          <w:sz w:val="22"/>
-          <w:szCs w:val="22"/>
-        </w:rPr>
-        <w:t xml:space="preserve">        &lt;p&gt;Today is a great day for new beginnings. You may feel energized and ready to take on new challenges. A bold move at work could lead to positive results. Trust your instincts and don't be afraid to speak </w:t>
-      </w:r>
-      <w:proofErr w:type="gramStart"/>
-      <w:r>
-        <w:rPr>
-          <w:b w:val="0"/>
-          <w:bCs w:val="0"/>
-          <w:spacing w:val="-2"/>
-          <w:sz w:val="22"/>
-          <w:szCs w:val="22"/>
-        </w:rPr>
-        <w:t>up.&lt;</w:t>
-      </w:r>
-      <w:proofErr w:type="gramEnd"/>
-      <w:r>
-        <w:rPr>
-          <w:b w:val="0"/>
-          <w:bCs w:val="0"/>
-          <w:spacing w:val="-2"/>
-          <w:sz w:val="22"/>
-          <w:szCs w:val="22"/>
-        </w:rPr>
-        <w:t>/p&gt;</w:t>
+        <w:t xml:space="preserve">        &lt;h3&gt;Aries (Mar 21 - Apr 19)&lt;/h3&gt;</w:t>
+      </w:r>
+    </w:p>
+    <w:p>
+      <w:pPr>
+        <w:pStyle w:val="Heading1"/>
+        <w:spacing w:before="242"/>
+        <w:rPr>
+          <w:b w:val="0"/>
+          <w:bCs w:val="0"/>
+          <w:spacing w:val="-2"/>
+          <w:sz w:val="22"/>
+          <w:szCs w:val="22"/>
+        </w:rPr>
+      </w:pPr>
+      <w:r>
+        <w:rPr>
+          <w:b w:val="0"/>
+          <w:bCs w:val="0"/>
+          <w:spacing w:val="-2"/>
+          <w:sz w:val="22"/>
+          <w:szCs w:val="22"/>
+        </w:rPr>
+        <w:t xml:space="preserve">        &lt;p&gt;Today is a great day for new beginnings. You may feel energized and ready to take on new challenges. A bold move at work could lead to positive results. Trust your instincts and don't be afraid to speak up.&lt;/p&gt;</w:t>
       </w:r>
     </w:p>
     <w:p>
@@ -3453,74 +3214,30 @@
           <w:sz w:val="22"/>
           <w:szCs w:val="22"/>
         </w:rPr>
-        <w:t xml:space="preserve">        &lt;h3&gt;Taurus (Apr 20 - May </w:t>
-      </w:r>
-      <w:proofErr w:type="gramStart"/>
-      <w:r>
-        <w:rPr>
-          <w:b w:val="0"/>
-          <w:bCs w:val="0"/>
-          <w:spacing w:val="-2"/>
-          <w:sz w:val="22"/>
-          <w:szCs w:val="22"/>
-        </w:rPr>
-        <w:t>20)&lt;</w:t>
-      </w:r>
-      <w:proofErr w:type="gramEnd"/>
-      <w:r>
-        <w:rPr>
-          <w:b w:val="0"/>
-          <w:bCs w:val="0"/>
-          <w:spacing w:val="-2"/>
-          <w:sz w:val="22"/>
-          <w:szCs w:val="22"/>
-        </w:rPr>
-        <w:t>/h3&gt;</w:t>
-      </w:r>
-    </w:p>
-    <w:p>
-      <w:pPr>
-        <w:pStyle w:val="Heading1"/>
-        <w:spacing w:before="242"/>
-        <w:rPr>
-          <w:b w:val="0"/>
-          <w:bCs w:val="0"/>
-          <w:spacing w:val="-2"/>
-          <w:sz w:val="22"/>
-          <w:szCs w:val="22"/>
-        </w:rPr>
-      </w:pPr>
-      <w:r>
-        <w:rPr>
-          <w:b w:val="0"/>
-          <w:bCs w:val="0"/>
-          <w:spacing w:val="-2"/>
-          <w:sz w:val="22"/>
-          <w:szCs w:val="22"/>
-        </w:rPr>
-        <w:t xml:space="preserve">        &lt;p&gt;Financial stability is highlighted today. This is a good time to plan your budget and investments. A practical approach will serve you well. Don't rush into major decisions; take your </w:t>
-      </w:r>
-      <w:proofErr w:type="gramStart"/>
-      <w:r>
-        <w:rPr>
-          <w:b w:val="0"/>
-          <w:bCs w:val="0"/>
-          <w:spacing w:val="-2"/>
-          <w:sz w:val="22"/>
-          <w:szCs w:val="22"/>
-        </w:rPr>
-        <w:t>time.&lt;</w:t>
-      </w:r>
-      <w:proofErr w:type="gramEnd"/>
-      <w:r>
-        <w:rPr>
-          <w:b w:val="0"/>
-          <w:bCs w:val="0"/>
-          <w:spacing w:val="-2"/>
-          <w:sz w:val="22"/>
-          <w:szCs w:val="22"/>
-        </w:rPr>
-        <w:t>/p&gt;</w:t>
+        <w:t xml:space="preserve">        &lt;h3&gt;Taurus (Apr 20 - May 20)&lt;/h3&gt;</w:t>
+      </w:r>
+    </w:p>
+    <w:p>
+      <w:pPr>
+        <w:pStyle w:val="Heading1"/>
+        <w:spacing w:before="242"/>
+        <w:rPr>
+          <w:b w:val="0"/>
+          <w:bCs w:val="0"/>
+          <w:spacing w:val="-2"/>
+          <w:sz w:val="22"/>
+          <w:szCs w:val="22"/>
+        </w:rPr>
+      </w:pPr>
+      <w:r>
+        <w:rPr>
+          <w:b w:val="0"/>
+          <w:bCs w:val="0"/>
+          <w:spacing w:val="-2"/>
+          <w:sz w:val="22"/>
+          <w:szCs w:val="22"/>
+        </w:rPr>
+        <w:t xml:space="preserve">        &lt;p&gt;Financial stability is highlighted today. This is a good time to plan your budget and investments. A practical approach will serve you well. Don't rush into major decisions; take your time.&lt;/p&gt;</w:t>
       </w:r>
     </w:p>
     <w:p>
@@ -3863,74 +3580,30 @@
           <w:sz w:val="22"/>
           <w:szCs w:val="22"/>
         </w:rPr>
-        <w:t xml:space="preserve">        &lt;h3&gt;Gemini (May 21 - Jun </w:t>
-      </w:r>
-      <w:proofErr w:type="gramStart"/>
-      <w:r>
-        <w:rPr>
-          <w:b w:val="0"/>
-          <w:bCs w:val="0"/>
-          <w:spacing w:val="-2"/>
-          <w:sz w:val="22"/>
-          <w:szCs w:val="22"/>
-        </w:rPr>
-        <w:t>20)&lt;</w:t>
-      </w:r>
-      <w:proofErr w:type="gramEnd"/>
-      <w:r>
-        <w:rPr>
-          <w:b w:val="0"/>
-          <w:bCs w:val="0"/>
-          <w:spacing w:val="-2"/>
-          <w:sz w:val="22"/>
-          <w:szCs w:val="22"/>
-        </w:rPr>
-        <w:t>/h3&gt;</w:t>
-      </w:r>
-    </w:p>
-    <w:p>
-      <w:pPr>
-        <w:pStyle w:val="Heading1"/>
-        <w:spacing w:before="242"/>
-        <w:rPr>
-          <w:b w:val="0"/>
-          <w:bCs w:val="0"/>
-          <w:spacing w:val="-2"/>
-          <w:sz w:val="22"/>
-          <w:szCs w:val="22"/>
-        </w:rPr>
-      </w:pPr>
-      <w:r>
-        <w:rPr>
-          <w:b w:val="0"/>
-          <w:bCs w:val="0"/>
-          <w:spacing w:val="-2"/>
-          <w:sz w:val="22"/>
-          <w:szCs w:val="22"/>
-        </w:rPr>
-        <w:t xml:space="preserve">        &lt;p&gt;Communication is your strength today. A conversation with someone important could bring clarity and understanding. Share your ideas and listen to others. Networking may open new doors for </w:t>
-      </w:r>
-      <w:proofErr w:type="gramStart"/>
-      <w:r>
-        <w:rPr>
-          <w:b w:val="0"/>
-          <w:bCs w:val="0"/>
-          <w:spacing w:val="-2"/>
-          <w:sz w:val="22"/>
-          <w:szCs w:val="22"/>
-        </w:rPr>
-        <w:t>you.&lt;</w:t>
-      </w:r>
-      <w:proofErr w:type="gramEnd"/>
-      <w:r>
-        <w:rPr>
-          <w:b w:val="0"/>
-          <w:bCs w:val="0"/>
-          <w:spacing w:val="-2"/>
-          <w:sz w:val="22"/>
-          <w:szCs w:val="22"/>
-        </w:rPr>
-        <w:t>/p&gt;</w:t>
+        <w:t xml:space="preserve">        &lt;h3&gt;Gemini (May 21 - Jun 20)&lt;/h3&gt;</w:t>
+      </w:r>
+    </w:p>
+    <w:p>
+      <w:pPr>
+        <w:pStyle w:val="Heading1"/>
+        <w:spacing w:before="242"/>
+        <w:rPr>
+          <w:b w:val="0"/>
+          <w:bCs w:val="0"/>
+          <w:spacing w:val="-2"/>
+          <w:sz w:val="22"/>
+          <w:szCs w:val="22"/>
+        </w:rPr>
+      </w:pPr>
+      <w:r>
+        <w:rPr>
+          <w:b w:val="0"/>
+          <w:bCs w:val="0"/>
+          <w:spacing w:val="-2"/>
+          <w:sz w:val="22"/>
+          <w:szCs w:val="22"/>
+        </w:rPr>
+        <w:t xml:space="preserve">        &lt;p&gt;Communication is your strength today. A conversation with someone important could bring clarity and understanding. Share your ideas and listen to others. Networking may open new doors for you.&lt;/p&gt;</w:t>
       </w:r>
     </w:p>
     <w:p>
@@ -4035,74 +3708,30 @@
           <w:sz w:val="22"/>
           <w:szCs w:val="22"/>
         </w:rPr>
-        <w:t xml:space="preserve">        &lt;h3&gt;Cancer (Jun 21 - Jul </w:t>
-      </w:r>
-      <w:proofErr w:type="gramStart"/>
-      <w:r>
-        <w:rPr>
-          <w:b w:val="0"/>
-          <w:bCs w:val="0"/>
-          <w:spacing w:val="-2"/>
-          <w:sz w:val="22"/>
-          <w:szCs w:val="22"/>
-        </w:rPr>
-        <w:t>22)&lt;</w:t>
-      </w:r>
-      <w:proofErr w:type="gramEnd"/>
-      <w:r>
-        <w:rPr>
-          <w:b w:val="0"/>
-          <w:bCs w:val="0"/>
-          <w:spacing w:val="-2"/>
-          <w:sz w:val="22"/>
-          <w:szCs w:val="22"/>
-        </w:rPr>
-        <w:t>/h3&gt;</w:t>
-      </w:r>
-    </w:p>
-    <w:p>
-      <w:pPr>
-        <w:pStyle w:val="Heading1"/>
-        <w:spacing w:before="242"/>
-        <w:rPr>
-          <w:b w:val="0"/>
-          <w:bCs w:val="0"/>
-          <w:spacing w:val="-2"/>
-          <w:sz w:val="22"/>
-          <w:szCs w:val="22"/>
-        </w:rPr>
-      </w:pPr>
-      <w:r>
-        <w:rPr>
-          <w:b w:val="0"/>
-          <w:bCs w:val="0"/>
-          <w:spacing w:val="-2"/>
-          <w:sz w:val="22"/>
-          <w:szCs w:val="22"/>
-        </w:rPr>
-        <w:t xml:space="preserve">        &lt;p&gt;Focus on family and home today. It's a good time to spend quality time with loved ones. Emotional connections strengthen. Take care of yourself and create a peaceful </w:t>
-      </w:r>
-      <w:proofErr w:type="gramStart"/>
-      <w:r>
-        <w:rPr>
-          <w:b w:val="0"/>
-          <w:bCs w:val="0"/>
-          <w:spacing w:val="-2"/>
-          <w:sz w:val="22"/>
-          <w:szCs w:val="22"/>
-        </w:rPr>
-        <w:t>environment.&lt;</w:t>
-      </w:r>
-      <w:proofErr w:type="gramEnd"/>
-      <w:r>
-        <w:rPr>
-          <w:b w:val="0"/>
-          <w:bCs w:val="0"/>
-          <w:spacing w:val="-2"/>
-          <w:sz w:val="22"/>
-          <w:szCs w:val="22"/>
-        </w:rPr>
-        <w:t>/p&gt;</w:t>
+        <w:t xml:space="preserve">        &lt;h3&gt;Cancer (Jun 21 - Jul 22)&lt;/h3&gt;</w:t>
+      </w:r>
+    </w:p>
+    <w:p>
+      <w:pPr>
+        <w:pStyle w:val="Heading1"/>
+        <w:spacing w:before="242"/>
+        <w:rPr>
+          <w:b w:val="0"/>
+          <w:bCs w:val="0"/>
+          <w:spacing w:val="-2"/>
+          <w:sz w:val="22"/>
+          <w:szCs w:val="22"/>
+        </w:rPr>
+      </w:pPr>
+      <w:r>
+        <w:rPr>
+          <w:b w:val="0"/>
+          <w:bCs w:val="0"/>
+          <w:spacing w:val="-2"/>
+          <w:sz w:val="22"/>
+          <w:szCs w:val="22"/>
+        </w:rPr>
+        <w:t xml:space="preserve">        &lt;p&gt;Focus on family and home today. It's a good time to spend quality time with loved ones. Emotional connections strengthen. Take care of yourself and create a peaceful environment.&lt;/p&gt;</w:t>
       </w:r>
     </w:p>
     <w:p>
@@ -4207,74 +3836,30 @@
           <w:sz w:val="22"/>
           <w:szCs w:val="22"/>
         </w:rPr>
-        <w:t xml:space="preserve">        &lt;h3&gt;Leo (Jul 23 - Aug </w:t>
-      </w:r>
-      <w:proofErr w:type="gramStart"/>
-      <w:r>
-        <w:rPr>
-          <w:b w:val="0"/>
-          <w:bCs w:val="0"/>
-          <w:spacing w:val="-2"/>
-          <w:sz w:val="22"/>
-          <w:szCs w:val="22"/>
-        </w:rPr>
-        <w:t>22)&lt;</w:t>
-      </w:r>
-      <w:proofErr w:type="gramEnd"/>
-      <w:r>
-        <w:rPr>
-          <w:b w:val="0"/>
-          <w:bCs w:val="0"/>
-          <w:spacing w:val="-2"/>
-          <w:sz w:val="22"/>
-          <w:szCs w:val="22"/>
-        </w:rPr>
-        <w:t>/h3&gt;</w:t>
-      </w:r>
-    </w:p>
-    <w:p>
-      <w:pPr>
-        <w:pStyle w:val="Heading1"/>
-        <w:spacing w:before="242"/>
-        <w:rPr>
-          <w:b w:val="0"/>
-          <w:bCs w:val="0"/>
-          <w:spacing w:val="-2"/>
-          <w:sz w:val="22"/>
-          <w:szCs w:val="22"/>
-        </w:rPr>
-      </w:pPr>
-      <w:r>
-        <w:rPr>
-          <w:b w:val="0"/>
-          <w:bCs w:val="0"/>
-          <w:spacing w:val="-2"/>
-          <w:sz w:val="22"/>
-          <w:szCs w:val="22"/>
-        </w:rPr>
-        <w:t xml:space="preserve">        &lt;p&gt;Your creative energy is at its peak. This is the time to express yourself and share your talents with the world. A romantic opportunity may also arise. Shine bright and let your personality </w:t>
-      </w:r>
-      <w:proofErr w:type="gramStart"/>
-      <w:r>
-        <w:rPr>
-          <w:b w:val="0"/>
-          <w:bCs w:val="0"/>
-          <w:spacing w:val="-2"/>
-          <w:sz w:val="22"/>
-          <w:szCs w:val="22"/>
-        </w:rPr>
-        <w:t>radiate.&lt;</w:t>
-      </w:r>
-      <w:proofErr w:type="gramEnd"/>
-      <w:r>
-        <w:rPr>
-          <w:b w:val="0"/>
-          <w:bCs w:val="0"/>
-          <w:spacing w:val="-2"/>
-          <w:sz w:val="22"/>
-          <w:szCs w:val="22"/>
-        </w:rPr>
-        <w:t>/p&gt;</w:t>
+        <w:t xml:space="preserve">        &lt;h3&gt;Leo (Jul 23 - Aug 22)&lt;/h3&gt;</w:t>
+      </w:r>
+    </w:p>
+    <w:p>
+      <w:pPr>
+        <w:pStyle w:val="Heading1"/>
+        <w:spacing w:before="242"/>
+        <w:rPr>
+          <w:b w:val="0"/>
+          <w:bCs w:val="0"/>
+          <w:spacing w:val="-2"/>
+          <w:sz w:val="22"/>
+          <w:szCs w:val="22"/>
+        </w:rPr>
+      </w:pPr>
+      <w:r>
+        <w:rPr>
+          <w:b w:val="0"/>
+          <w:bCs w:val="0"/>
+          <w:spacing w:val="-2"/>
+          <w:sz w:val="22"/>
+          <w:szCs w:val="22"/>
+        </w:rPr>
+        <w:t xml:space="preserve">        &lt;p&gt;Your creative energy is at its peak. This is the time to express yourself and share your talents with the world. A romantic opportunity may also arise. Shine bright and let your personality radiate.&lt;/p&gt;</w:t>
       </w:r>
     </w:p>
     <w:p>
@@ -4379,74 +3964,30 @@
           <w:sz w:val="22"/>
           <w:szCs w:val="22"/>
         </w:rPr>
-        <w:t xml:space="preserve">        &lt;h3&gt;Virgo (Aug 23 - Sep </w:t>
-      </w:r>
-      <w:proofErr w:type="gramStart"/>
-      <w:r>
-        <w:rPr>
-          <w:b w:val="0"/>
-          <w:bCs w:val="0"/>
-          <w:spacing w:val="-2"/>
-          <w:sz w:val="22"/>
-          <w:szCs w:val="22"/>
-        </w:rPr>
-        <w:t>22)&lt;</w:t>
-      </w:r>
-      <w:proofErr w:type="gramEnd"/>
-      <w:r>
-        <w:rPr>
-          <w:b w:val="0"/>
-          <w:bCs w:val="0"/>
-          <w:spacing w:val="-2"/>
-          <w:sz w:val="22"/>
-          <w:szCs w:val="22"/>
-        </w:rPr>
-        <w:t>/h3&gt;</w:t>
-      </w:r>
-    </w:p>
-    <w:p>
-      <w:pPr>
-        <w:pStyle w:val="Heading1"/>
-        <w:spacing w:before="242"/>
-        <w:rPr>
-          <w:b w:val="0"/>
-          <w:bCs w:val="0"/>
-          <w:spacing w:val="-2"/>
-          <w:sz w:val="22"/>
-          <w:szCs w:val="22"/>
-        </w:rPr>
-      </w:pPr>
-      <w:r>
-        <w:rPr>
-          <w:b w:val="0"/>
-          <w:bCs w:val="0"/>
-          <w:spacing w:val="-2"/>
-          <w:sz w:val="22"/>
-          <w:szCs w:val="22"/>
-        </w:rPr>
-        <w:t xml:space="preserve">        &lt;p&gt;Health and wellness are in focus. Pay attention to your physical and mental well-being. Organize your schedule and create healthy habits. A quiet day at home is </w:t>
-      </w:r>
-      <w:proofErr w:type="gramStart"/>
-      <w:r>
-        <w:rPr>
-          <w:b w:val="0"/>
-          <w:bCs w:val="0"/>
-          <w:spacing w:val="-2"/>
-          <w:sz w:val="22"/>
-          <w:szCs w:val="22"/>
-        </w:rPr>
-        <w:t>recommended.&lt;</w:t>
-      </w:r>
-      <w:proofErr w:type="gramEnd"/>
-      <w:r>
-        <w:rPr>
-          <w:b w:val="0"/>
-          <w:bCs w:val="0"/>
-          <w:spacing w:val="-2"/>
-          <w:sz w:val="22"/>
-          <w:szCs w:val="22"/>
-        </w:rPr>
-        <w:t>/p&gt;</w:t>
+        <w:t xml:space="preserve">        &lt;h3&gt;Virgo (Aug 23 - Sep 22)&lt;/h3&gt;</w:t>
+      </w:r>
+    </w:p>
+    <w:p>
+      <w:pPr>
+        <w:pStyle w:val="Heading1"/>
+        <w:spacing w:before="242"/>
+        <w:rPr>
+          <w:b w:val="0"/>
+          <w:bCs w:val="0"/>
+          <w:spacing w:val="-2"/>
+          <w:sz w:val="22"/>
+          <w:szCs w:val="22"/>
+        </w:rPr>
+      </w:pPr>
+      <w:r>
+        <w:rPr>
+          <w:b w:val="0"/>
+          <w:bCs w:val="0"/>
+          <w:spacing w:val="-2"/>
+          <w:sz w:val="22"/>
+          <w:szCs w:val="22"/>
+        </w:rPr>
+        <w:t xml:space="preserve">        &lt;p&gt;Health and wellness are in focus. Pay attention to your physical and mental well-being. Organize your schedule and create healthy habits. A quiet day at home is recommended.&lt;/p&gt;</w:t>
       </w:r>
     </w:p>
     <w:p>
@@ -4551,29 +4092,7 @@
           <w:sz w:val="22"/>
           <w:szCs w:val="22"/>
         </w:rPr>
-        <w:t xml:space="preserve">  &lt;h3&gt;Libra (Sep 23 - Oct </w:t>
-      </w:r>
-      <w:proofErr w:type="gramStart"/>
-      <w:r>
-        <w:rPr>
-          <w:b w:val="0"/>
-          <w:bCs w:val="0"/>
-          <w:spacing w:val="-2"/>
-          <w:sz w:val="22"/>
-          <w:szCs w:val="22"/>
-        </w:rPr>
-        <w:t>22)&lt;</w:t>
-      </w:r>
-      <w:proofErr w:type="gramEnd"/>
-      <w:r>
-        <w:rPr>
-          <w:b w:val="0"/>
-          <w:bCs w:val="0"/>
-          <w:spacing w:val="-2"/>
-          <w:sz w:val="22"/>
-          <w:szCs w:val="22"/>
-        </w:rPr>
-        <w:t>/h3&gt;</w:t>
+        <w:t xml:space="preserve">  &lt;h3&gt;Libra (Sep 23 - Oct 22)&lt;/h3&gt;</w:t>
       </w:r>
     </w:p>
     <w:p>
@@ -4858,29 +4377,7 @@
           <w:sz w:val="22"/>
           <w:szCs w:val="22"/>
         </w:rPr>
-        <w:t xml:space="preserve">  &lt;p&gt;Social interactions are highlighted. Friends and colleagues seek your company and advice. A fun event or gathering may bring joy. Balance your work and social </w:t>
-      </w:r>
-      <w:proofErr w:type="gramStart"/>
-      <w:r>
-        <w:rPr>
-          <w:b w:val="0"/>
-          <w:bCs w:val="0"/>
-          <w:spacing w:val="-2"/>
-          <w:sz w:val="22"/>
-          <w:szCs w:val="22"/>
-        </w:rPr>
-        <w:t>life.&lt;</w:t>
-      </w:r>
-      <w:proofErr w:type="gramEnd"/>
-      <w:r>
-        <w:rPr>
-          <w:b w:val="0"/>
-          <w:bCs w:val="0"/>
-          <w:spacing w:val="-2"/>
-          <w:sz w:val="22"/>
-          <w:szCs w:val="22"/>
-        </w:rPr>
-        <w:t>/p&gt;</w:t>
+        <w:t xml:space="preserve">  &lt;p&gt;Social interactions are highlighted. Friends and colleagues seek your company and advice. A fun event or gathering may bring joy. Balance your work and social life.&lt;/p&gt;</w:t>
       </w:r>
     </w:p>
     <w:p>
@@ -4972,74 +4469,30 @@
           <w:sz w:val="22"/>
           <w:szCs w:val="22"/>
         </w:rPr>
-        <w:t xml:space="preserve">        &lt;h3&gt;Scorpio (Oct 23 - Nov </w:t>
-      </w:r>
-      <w:proofErr w:type="gramStart"/>
-      <w:r>
-        <w:rPr>
-          <w:b w:val="0"/>
-          <w:bCs w:val="0"/>
-          <w:spacing w:val="-2"/>
-          <w:sz w:val="22"/>
-          <w:szCs w:val="22"/>
-        </w:rPr>
-        <w:t>21)&lt;</w:t>
-      </w:r>
-      <w:proofErr w:type="gramEnd"/>
-      <w:r>
-        <w:rPr>
-          <w:b w:val="0"/>
-          <w:bCs w:val="0"/>
-          <w:spacing w:val="-2"/>
-          <w:sz w:val="22"/>
-          <w:szCs w:val="22"/>
-        </w:rPr>
-        <w:t>/h3&gt;</w:t>
-      </w:r>
-    </w:p>
-    <w:p>
-      <w:pPr>
-        <w:pStyle w:val="Heading1"/>
-        <w:spacing w:before="242"/>
-        <w:rPr>
-          <w:b w:val="0"/>
-          <w:bCs w:val="0"/>
-          <w:spacing w:val="-2"/>
-          <w:sz w:val="22"/>
-          <w:szCs w:val="22"/>
-        </w:rPr>
-      </w:pPr>
-      <w:r>
-        <w:rPr>
-          <w:b w:val="0"/>
-          <w:bCs w:val="0"/>
-          <w:spacing w:val="-2"/>
-          <w:sz w:val="22"/>
-          <w:szCs w:val="22"/>
-        </w:rPr>
-        <w:t xml:space="preserve">        &lt;p&gt;Professional achievements are possible today. Your hard work may be recognized and rewarded. Focus on your career goals. A promotion or new opportunity could come your </w:t>
-      </w:r>
-      <w:proofErr w:type="gramStart"/>
-      <w:r>
-        <w:rPr>
-          <w:b w:val="0"/>
-          <w:bCs w:val="0"/>
-          <w:spacing w:val="-2"/>
-          <w:sz w:val="22"/>
-          <w:szCs w:val="22"/>
-        </w:rPr>
-        <w:t>way.&lt;</w:t>
-      </w:r>
-      <w:proofErr w:type="gramEnd"/>
-      <w:r>
-        <w:rPr>
-          <w:b w:val="0"/>
-          <w:bCs w:val="0"/>
-          <w:spacing w:val="-2"/>
-          <w:sz w:val="22"/>
-          <w:szCs w:val="22"/>
-        </w:rPr>
-        <w:t>/p&gt;</w:t>
+        <w:t xml:space="preserve">        &lt;h3&gt;Scorpio (Oct 23 - Nov 21)&lt;/h3&gt;</w:t>
+      </w:r>
+    </w:p>
+    <w:p>
+      <w:pPr>
+        <w:pStyle w:val="Heading1"/>
+        <w:spacing w:before="242"/>
+        <w:rPr>
+          <w:b w:val="0"/>
+          <w:bCs w:val="0"/>
+          <w:spacing w:val="-2"/>
+          <w:sz w:val="22"/>
+          <w:szCs w:val="22"/>
+        </w:rPr>
+      </w:pPr>
+      <w:r>
+        <w:rPr>
+          <w:b w:val="0"/>
+          <w:bCs w:val="0"/>
+          <w:spacing w:val="-2"/>
+          <w:sz w:val="22"/>
+          <w:szCs w:val="22"/>
+        </w:rPr>
+        <w:t xml:space="preserve">        &lt;p&gt;Professional achievements are possible today. Your hard work may be recognized and rewarded. Focus on your career goals. A promotion or new opportunity could come your way.&lt;/p&gt;</w:t>
       </w:r>
     </w:p>
     <w:p>
@@ -5144,74 +4597,30 @@
           <w:sz w:val="22"/>
           <w:szCs w:val="22"/>
         </w:rPr>
-        <w:t xml:space="preserve">        &lt;h3&gt;Sagittarius (Nov 22 - Dec </w:t>
-      </w:r>
-      <w:proofErr w:type="gramStart"/>
-      <w:r>
-        <w:rPr>
-          <w:b w:val="0"/>
-          <w:bCs w:val="0"/>
-          <w:spacing w:val="-2"/>
-          <w:sz w:val="22"/>
-          <w:szCs w:val="22"/>
-        </w:rPr>
-        <w:t>21)&lt;</w:t>
-      </w:r>
-      <w:proofErr w:type="gramEnd"/>
-      <w:r>
-        <w:rPr>
-          <w:b w:val="0"/>
-          <w:bCs w:val="0"/>
-          <w:spacing w:val="-2"/>
-          <w:sz w:val="22"/>
-          <w:szCs w:val="22"/>
-        </w:rPr>
-        <w:t>/h3&gt;</w:t>
-      </w:r>
-    </w:p>
-    <w:p>
-      <w:pPr>
-        <w:pStyle w:val="Heading1"/>
-        <w:spacing w:before="242"/>
-        <w:rPr>
-          <w:b w:val="0"/>
-          <w:bCs w:val="0"/>
-          <w:spacing w:val="-2"/>
-          <w:sz w:val="22"/>
-          <w:szCs w:val="22"/>
-        </w:rPr>
-      </w:pPr>
-      <w:r>
-        <w:rPr>
-          <w:b w:val="0"/>
-          <w:bCs w:val="0"/>
-          <w:spacing w:val="-2"/>
-          <w:sz w:val="22"/>
-          <w:szCs w:val="22"/>
-        </w:rPr>
-        <w:t xml:space="preserve">        &lt;p&gt;Adventure and learning are calling. Travel, study, or explore new ideas. Expand your horizons and seek knowledge. An exciting opportunity for personal growth awaits </w:t>
-      </w:r>
-      <w:proofErr w:type="gramStart"/>
-      <w:r>
-        <w:rPr>
-          <w:b w:val="0"/>
-          <w:bCs w:val="0"/>
-          <w:spacing w:val="-2"/>
-          <w:sz w:val="22"/>
-          <w:szCs w:val="22"/>
-        </w:rPr>
-        <w:t>you.&lt;</w:t>
-      </w:r>
-      <w:proofErr w:type="gramEnd"/>
-      <w:r>
-        <w:rPr>
-          <w:b w:val="0"/>
-          <w:bCs w:val="0"/>
-          <w:spacing w:val="-2"/>
-          <w:sz w:val="22"/>
-          <w:szCs w:val="22"/>
-        </w:rPr>
-        <w:t>/p&gt;</w:t>
+        <w:t xml:space="preserve">        &lt;h3&gt;Sagittarius (Nov 22 - Dec 21)&lt;/h3&gt;</w:t>
+      </w:r>
+    </w:p>
+    <w:p>
+      <w:pPr>
+        <w:pStyle w:val="Heading1"/>
+        <w:spacing w:before="242"/>
+        <w:rPr>
+          <w:b w:val="0"/>
+          <w:bCs w:val="0"/>
+          <w:spacing w:val="-2"/>
+          <w:sz w:val="22"/>
+          <w:szCs w:val="22"/>
+        </w:rPr>
+      </w:pPr>
+      <w:r>
+        <w:rPr>
+          <w:b w:val="0"/>
+          <w:bCs w:val="0"/>
+          <w:spacing w:val="-2"/>
+          <w:sz w:val="22"/>
+          <w:szCs w:val="22"/>
+        </w:rPr>
+        <w:t xml:space="preserve">        &lt;p&gt;Adventure and learning are calling. Travel, study, or explore new ideas. Expand your horizons and seek knowledge. An exciting opportunity for personal growth awaits you.&lt;/p&gt;</w:t>
       </w:r>
     </w:p>
     <w:p>
@@ -5316,74 +4725,30 @@
           <w:sz w:val="22"/>
           <w:szCs w:val="22"/>
         </w:rPr>
-        <w:t xml:space="preserve">        &lt;h3&gt;Capricorn (Dec 22 - Jan </w:t>
-      </w:r>
-      <w:proofErr w:type="gramStart"/>
-      <w:r>
-        <w:rPr>
-          <w:b w:val="0"/>
-          <w:bCs w:val="0"/>
-          <w:spacing w:val="-2"/>
-          <w:sz w:val="22"/>
-          <w:szCs w:val="22"/>
-        </w:rPr>
-        <w:t>19)&lt;</w:t>
-      </w:r>
-      <w:proofErr w:type="gramEnd"/>
-      <w:r>
-        <w:rPr>
-          <w:b w:val="0"/>
-          <w:bCs w:val="0"/>
-          <w:spacing w:val="-2"/>
-          <w:sz w:val="22"/>
-          <w:szCs w:val="22"/>
-        </w:rPr>
-        <w:t>/h3&gt;</w:t>
-      </w:r>
-    </w:p>
-    <w:p>
-      <w:pPr>
-        <w:pStyle w:val="Heading1"/>
-        <w:spacing w:before="242"/>
-        <w:rPr>
-          <w:b w:val="0"/>
-          <w:bCs w:val="0"/>
-          <w:spacing w:val="-2"/>
-          <w:sz w:val="22"/>
-          <w:szCs w:val="22"/>
-        </w:rPr>
-      </w:pPr>
-      <w:r>
-        <w:rPr>
-          <w:b w:val="0"/>
-          <w:bCs w:val="0"/>
-          <w:spacing w:val="-2"/>
-          <w:sz w:val="22"/>
-          <w:szCs w:val="22"/>
-        </w:rPr>
-        <w:t xml:space="preserve">        &lt;p&gt;Financial matters improve. Investments may yield positive returns. Plan strategically for the future. A practical approach to money will benefit you. Avoid impulse </w:t>
-      </w:r>
-      <w:proofErr w:type="gramStart"/>
-      <w:r>
-        <w:rPr>
-          <w:b w:val="0"/>
-          <w:bCs w:val="0"/>
-          <w:spacing w:val="-2"/>
-          <w:sz w:val="22"/>
-          <w:szCs w:val="22"/>
-        </w:rPr>
-        <w:t>spending.&lt;</w:t>
-      </w:r>
-      <w:proofErr w:type="gramEnd"/>
-      <w:r>
-        <w:rPr>
-          <w:b w:val="0"/>
-          <w:bCs w:val="0"/>
-          <w:spacing w:val="-2"/>
-          <w:sz w:val="22"/>
-          <w:szCs w:val="22"/>
-        </w:rPr>
-        <w:t>/p&gt;</w:t>
+        <w:t xml:space="preserve">        &lt;h3&gt;Capricorn (Dec 22 - Jan 19)&lt;/h3&gt;</w:t>
+      </w:r>
+    </w:p>
+    <w:p>
+      <w:pPr>
+        <w:pStyle w:val="Heading1"/>
+        <w:spacing w:before="242"/>
+        <w:rPr>
+          <w:b w:val="0"/>
+          <w:bCs w:val="0"/>
+          <w:spacing w:val="-2"/>
+          <w:sz w:val="22"/>
+          <w:szCs w:val="22"/>
+        </w:rPr>
+      </w:pPr>
+      <w:r>
+        <w:rPr>
+          <w:b w:val="0"/>
+          <w:bCs w:val="0"/>
+          <w:spacing w:val="-2"/>
+          <w:sz w:val="22"/>
+          <w:szCs w:val="22"/>
+        </w:rPr>
+        <w:t xml:space="preserve">        &lt;p&gt;Financial matters improve. Investments may yield positive returns. Plan strategically for the future. A practical approach to money will benefit you. Avoid impulse spending.&lt;/p&gt;</w:t>
       </w:r>
     </w:p>
     <w:p>
@@ -5488,74 +4853,30 @@
           <w:sz w:val="22"/>
           <w:szCs w:val="22"/>
         </w:rPr>
-        <w:t xml:space="preserve">        &lt;h3&gt;Aquarius (Jan 20 - Feb </w:t>
-      </w:r>
-      <w:proofErr w:type="gramStart"/>
-      <w:r>
-        <w:rPr>
-          <w:b w:val="0"/>
-          <w:bCs w:val="0"/>
-          <w:spacing w:val="-2"/>
-          <w:sz w:val="22"/>
-          <w:szCs w:val="22"/>
-        </w:rPr>
-        <w:t>18)&lt;</w:t>
-      </w:r>
-      <w:proofErr w:type="gramEnd"/>
-      <w:r>
-        <w:rPr>
-          <w:b w:val="0"/>
-          <w:bCs w:val="0"/>
-          <w:spacing w:val="-2"/>
-          <w:sz w:val="22"/>
-          <w:szCs w:val="22"/>
-        </w:rPr>
-        <w:t>/h3&gt;</w:t>
-      </w:r>
-    </w:p>
-    <w:p>
-      <w:pPr>
-        <w:pStyle w:val="Heading1"/>
-        <w:spacing w:before="242"/>
-        <w:rPr>
-          <w:b w:val="0"/>
-          <w:bCs w:val="0"/>
-          <w:spacing w:val="-2"/>
-          <w:sz w:val="22"/>
-          <w:szCs w:val="22"/>
-        </w:rPr>
-      </w:pPr>
-      <w:r>
-        <w:rPr>
-          <w:b w:val="0"/>
-          <w:bCs w:val="0"/>
-          <w:spacing w:val="-2"/>
-          <w:sz w:val="22"/>
-          <w:szCs w:val="22"/>
-        </w:rPr>
-        <w:t xml:space="preserve">        &lt;p&gt;Relationships take center stage. Strengthen bonds with loved ones. A meaningful conversation or romantic moment is possible. Collaborate with others to achieve shared </w:t>
-      </w:r>
-      <w:proofErr w:type="gramStart"/>
-      <w:r>
-        <w:rPr>
-          <w:b w:val="0"/>
-          <w:bCs w:val="0"/>
-          <w:spacing w:val="-2"/>
-          <w:sz w:val="22"/>
-          <w:szCs w:val="22"/>
-        </w:rPr>
-        <w:t>goals.&lt;</w:t>
-      </w:r>
-      <w:proofErr w:type="gramEnd"/>
-      <w:r>
-        <w:rPr>
-          <w:b w:val="0"/>
-          <w:bCs w:val="0"/>
-          <w:spacing w:val="-2"/>
-          <w:sz w:val="22"/>
-          <w:szCs w:val="22"/>
-        </w:rPr>
-        <w:t>/p&gt;</w:t>
+        <w:t xml:space="preserve">        &lt;h3&gt;Aquarius (Jan 20 - Feb 18)&lt;/h3&gt;</w:t>
+      </w:r>
+    </w:p>
+    <w:p>
+      <w:pPr>
+        <w:pStyle w:val="Heading1"/>
+        <w:spacing w:before="242"/>
+        <w:rPr>
+          <w:b w:val="0"/>
+          <w:bCs w:val="0"/>
+          <w:spacing w:val="-2"/>
+          <w:sz w:val="22"/>
+          <w:szCs w:val="22"/>
+        </w:rPr>
+      </w:pPr>
+      <w:r>
+        <w:rPr>
+          <w:b w:val="0"/>
+          <w:bCs w:val="0"/>
+          <w:spacing w:val="-2"/>
+          <w:sz w:val="22"/>
+          <w:szCs w:val="22"/>
+        </w:rPr>
+        <w:t xml:space="preserve">        &lt;p&gt;Relationships take center stage. Strengthen bonds with loved ones. A meaningful conversation or romantic moment is possible. Collaborate with others to achieve shared goals.&lt;/p&gt;</w:t>
       </w:r>
       <w:r>
         <w:rPr>
@@ -5898,74 +5219,30 @@
           <w:sz w:val="22"/>
           <w:szCs w:val="22"/>
         </w:rPr>
-        <w:t xml:space="preserve">        &lt;h3&gt;Pisces (Feb 19 - Mar </w:t>
-      </w:r>
-      <w:proofErr w:type="gramStart"/>
-      <w:r>
-        <w:rPr>
-          <w:b w:val="0"/>
-          <w:bCs w:val="0"/>
-          <w:spacing w:val="-2"/>
-          <w:sz w:val="22"/>
-          <w:szCs w:val="22"/>
-        </w:rPr>
-        <w:t>20)&lt;</w:t>
-      </w:r>
-      <w:proofErr w:type="gramEnd"/>
-      <w:r>
-        <w:rPr>
-          <w:b w:val="0"/>
-          <w:bCs w:val="0"/>
-          <w:spacing w:val="-2"/>
-          <w:sz w:val="22"/>
-          <w:szCs w:val="22"/>
-        </w:rPr>
-        <w:t>/h3&gt;</w:t>
-      </w:r>
-    </w:p>
-    <w:p>
-      <w:pPr>
-        <w:pStyle w:val="Heading1"/>
-        <w:spacing w:before="242"/>
-        <w:rPr>
-          <w:b w:val="0"/>
-          <w:bCs w:val="0"/>
-          <w:spacing w:val="-2"/>
-          <w:sz w:val="22"/>
-          <w:szCs w:val="22"/>
-        </w:rPr>
-      </w:pPr>
-      <w:r>
-        <w:rPr>
-          <w:b w:val="0"/>
-          <w:bCs w:val="0"/>
-          <w:spacing w:val="-2"/>
-          <w:sz w:val="22"/>
-          <w:szCs w:val="22"/>
-        </w:rPr>
-        <w:t xml:space="preserve">        &lt;p&gt;Creativity and intuition guide you today. Trust your inner voice and follow your dreams. A spiritual or artistic pursuit brings fulfillment. Self-expression is powerful </w:t>
-      </w:r>
-      <w:proofErr w:type="gramStart"/>
-      <w:r>
-        <w:rPr>
-          <w:b w:val="0"/>
-          <w:bCs w:val="0"/>
-          <w:spacing w:val="-2"/>
-          <w:sz w:val="22"/>
-          <w:szCs w:val="22"/>
-        </w:rPr>
-        <w:t>now.&lt;</w:t>
-      </w:r>
-      <w:proofErr w:type="gramEnd"/>
-      <w:r>
-        <w:rPr>
-          <w:b w:val="0"/>
-          <w:bCs w:val="0"/>
-          <w:spacing w:val="-2"/>
-          <w:sz w:val="22"/>
-          <w:szCs w:val="22"/>
-        </w:rPr>
-        <w:t>/p&gt;</w:t>
+        <w:t xml:space="preserve">        &lt;h3&gt;Pisces (Feb 19 - Mar 20)&lt;/h3&gt;</w:t>
+      </w:r>
+    </w:p>
+    <w:p>
+      <w:pPr>
+        <w:pStyle w:val="Heading1"/>
+        <w:spacing w:before="242"/>
+        <w:rPr>
+          <w:b w:val="0"/>
+          <w:bCs w:val="0"/>
+          <w:spacing w:val="-2"/>
+          <w:sz w:val="22"/>
+          <w:szCs w:val="22"/>
+        </w:rPr>
+      </w:pPr>
+      <w:r>
+        <w:rPr>
+          <w:b w:val="0"/>
+          <w:bCs w:val="0"/>
+          <w:spacing w:val="-2"/>
+          <w:sz w:val="22"/>
+          <w:szCs w:val="22"/>
+        </w:rPr>
+        <w:t xml:space="preserve">        &lt;p&gt;Creativity and intuition guide you today. Trust your inner voice and follow your dreams. A spiritual or artistic pursuit brings fulfillment. Self-expression is powerful now.&lt;/p&gt;</w:t>
       </w:r>
     </w:p>
     <w:p>
@@ -6313,163 +5590,53 @@
           <w:sz w:val="22"/>
           <w:szCs w:val="22"/>
         </w:rPr>
-        <w:t xml:space="preserve">        &lt;p&gt;&amp;copy; 2024 </w:t>
-      </w:r>
-      <w:proofErr w:type="spellStart"/>
-      <w:r>
-        <w:rPr>
-          <w:b w:val="0"/>
-          <w:bCs w:val="0"/>
-          <w:spacing w:val="-2"/>
-          <w:sz w:val="22"/>
-          <w:szCs w:val="22"/>
-        </w:rPr>
-        <w:t>StarVerse</w:t>
-      </w:r>
-      <w:proofErr w:type="spellEnd"/>
-      <w:r>
-        <w:rPr>
-          <w:b w:val="0"/>
-          <w:bCs w:val="0"/>
-          <w:spacing w:val="-2"/>
-          <w:sz w:val="22"/>
-          <w:szCs w:val="22"/>
-        </w:rPr>
-        <w:t xml:space="preserve">. All rights </w:t>
-      </w:r>
-      <w:proofErr w:type="gramStart"/>
-      <w:r>
-        <w:rPr>
-          <w:b w:val="0"/>
-          <w:bCs w:val="0"/>
-          <w:spacing w:val="-2"/>
-          <w:sz w:val="22"/>
-          <w:szCs w:val="22"/>
-        </w:rPr>
-        <w:t>reserved.&lt;</w:t>
-      </w:r>
-      <w:proofErr w:type="gramEnd"/>
-      <w:r>
-        <w:rPr>
-          <w:b w:val="0"/>
-          <w:bCs w:val="0"/>
-          <w:spacing w:val="-2"/>
-          <w:sz w:val="22"/>
-          <w:szCs w:val="22"/>
-        </w:rPr>
-        <w:t>/p&gt;</w:t>
-      </w:r>
-    </w:p>
-    <w:p>
-      <w:pPr>
-        <w:pStyle w:val="Heading1"/>
-        <w:spacing w:before="242"/>
-        <w:rPr>
-          <w:b w:val="0"/>
-          <w:bCs w:val="0"/>
-          <w:spacing w:val="-2"/>
-          <w:sz w:val="22"/>
-          <w:szCs w:val="22"/>
-        </w:rPr>
-      </w:pPr>
-      <w:r>
-        <w:rPr>
-          <w:b w:val="0"/>
-          <w:bCs w:val="0"/>
-          <w:spacing w:val="-2"/>
-          <w:sz w:val="22"/>
-          <w:szCs w:val="22"/>
-        </w:rPr>
-        <w:t xml:space="preserve">        &lt;p&gt;Email: &lt;a </w:t>
-      </w:r>
-      <w:proofErr w:type="spellStart"/>
-      <w:r>
-        <w:rPr>
-          <w:b w:val="0"/>
-          <w:bCs w:val="0"/>
-          <w:spacing w:val="-2"/>
-          <w:sz w:val="22"/>
-          <w:szCs w:val="22"/>
-        </w:rPr>
-        <w:t>href</w:t>
-      </w:r>
-      <w:proofErr w:type="spellEnd"/>
-      <w:r>
-        <w:rPr>
-          <w:b w:val="0"/>
-          <w:bCs w:val="0"/>
-          <w:spacing w:val="-2"/>
-          <w:sz w:val="22"/>
-          <w:szCs w:val="22"/>
-        </w:rPr>
-        <w:t>="mailto:info@starverse.com"&gt;info@starverse.com&lt;/a&gt;&lt;/p&gt;</w:t>
-      </w:r>
-    </w:p>
-    <w:p>
-      <w:pPr>
-        <w:pStyle w:val="Heading1"/>
-        <w:spacing w:before="242"/>
-        <w:rPr>
-          <w:b w:val="0"/>
-          <w:bCs w:val="0"/>
-          <w:spacing w:val="-2"/>
-          <w:sz w:val="22"/>
-          <w:szCs w:val="22"/>
-        </w:rPr>
-      </w:pPr>
-      <w:r>
-        <w:rPr>
-          <w:b w:val="0"/>
-          <w:bCs w:val="0"/>
-          <w:spacing w:val="-2"/>
-          <w:sz w:val="22"/>
-          <w:szCs w:val="22"/>
-        </w:rPr>
-        <w:t xml:space="preserve">        &lt;p&gt;&lt;</w:t>
-      </w:r>
-      <w:proofErr w:type="spellStart"/>
-      <w:r>
-        <w:rPr>
-          <w:b w:val="0"/>
-          <w:bCs w:val="0"/>
-          <w:spacing w:val="-2"/>
-          <w:sz w:val="22"/>
-          <w:szCs w:val="22"/>
-        </w:rPr>
-        <w:t>em</w:t>
-      </w:r>
-      <w:proofErr w:type="spellEnd"/>
-      <w:r>
-        <w:rPr>
-          <w:b w:val="0"/>
-          <w:bCs w:val="0"/>
-          <w:spacing w:val="-2"/>
-          <w:sz w:val="22"/>
-          <w:szCs w:val="22"/>
-        </w:rPr>
-        <w:t>&gt;"Every day brings new cosmic possibilities."&lt;/</w:t>
-      </w:r>
-      <w:proofErr w:type="spellStart"/>
-      <w:r>
-        <w:rPr>
-          <w:b w:val="0"/>
-          <w:bCs w:val="0"/>
-          <w:spacing w:val="-2"/>
-          <w:sz w:val="22"/>
-          <w:szCs w:val="22"/>
-        </w:rPr>
-        <w:t>em</w:t>
-      </w:r>
-      <w:proofErr w:type="spellEnd"/>
-      <w:r>
-        <w:rPr>
-          <w:b w:val="0"/>
-          <w:bCs w:val="0"/>
-          <w:spacing w:val="-2"/>
-          <w:sz w:val="22"/>
-          <w:szCs w:val="22"/>
-        </w:rPr>
-        <w:t>&gt;&lt;/p&gt;</w:t>
+        <w:t xml:space="preserve">        &lt;p&gt;&amp;copy; 2024 StarVerse. All rights reserved.&lt;/p&gt;</w:t>
+      </w:r>
+    </w:p>
+    <w:p>
+      <w:pPr>
+        <w:pStyle w:val="Heading1"/>
+        <w:spacing w:before="242"/>
+        <w:rPr>
+          <w:b w:val="0"/>
+          <w:bCs w:val="0"/>
+          <w:spacing w:val="-2"/>
+          <w:sz w:val="22"/>
+          <w:szCs w:val="22"/>
+        </w:rPr>
+      </w:pPr>
+      <w:r>
+        <w:rPr>
+          <w:b w:val="0"/>
+          <w:bCs w:val="0"/>
+          <w:spacing w:val="-2"/>
+          <w:sz w:val="22"/>
+          <w:szCs w:val="22"/>
+        </w:rPr>
+        <w:t xml:space="preserve">        &lt;p&gt;Email: &lt;a href="mailto:info@starverse.com"&gt;info@starverse.com&lt;/a&gt;&lt;/p&gt;</w:t>
+      </w:r>
+    </w:p>
+    <w:p>
+      <w:pPr>
+        <w:pStyle w:val="Heading1"/>
+        <w:spacing w:before="242"/>
+        <w:rPr>
+          <w:b w:val="0"/>
+          <w:bCs w:val="0"/>
+          <w:spacing w:val="-2"/>
+          <w:sz w:val="22"/>
+          <w:szCs w:val="22"/>
+        </w:rPr>
+      </w:pPr>
+      <w:r>
+        <w:rPr>
+          <w:b w:val="0"/>
+          <w:bCs w:val="0"/>
+          <w:spacing w:val="-2"/>
+          <w:sz w:val="22"/>
+          <w:szCs w:val="22"/>
+        </w:rPr>
+        <w:t xml:space="preserve">        &lt;p&gt;&lt;em&gt;"Every day brings new cosmic possibilities."&lt;/em&gt;&lt;/p&gt;</w:t>
       </w:r>
     </w:p>
     <w:p>
@@ -6866,27 +6033,7 @@
           <w:sz w:val="22"/>
           <w:szCs w:val="22"/>
         </w:rPr>
-        <w:t>&lt;html lang="</w:t>
-      </w:r>
-      <w:proofErr w:type="spellStart"/>
-      <w:r>
-        <w:rPr>
-          <w:b w:val="0"/>
-          <w:bCs w:val="0"/>
-          <w:sz w:val="22"/>
-          <w:szCs w:val="22"/>
-        </w:rPr>
-        <w:t>en</w:t>
-      </w:r>
-      <w:proofErr w:type="spellEnd"/>
-      <w:r>
-        <w:rPr>
-          <w:b w:val="0"/>
-          <w:bCs w:val="0"/>
-          <w:sz w:val="22"/>
-          <w:szCs w:val="22"/>
-        </w:rPr>
-        <w:t>"&gt;</w:t>
+        <w:t>&lt;html lang="en"&gt;</w:t>
       </w:r>
     </w:p>
     <w:p>
@@ -6986,27 +6133,7 @@
           <w:sz w:val="22"/>
           <w:szCs w:val="22"/>
         </w:rPr>
-        <w:t xml:space="preserve">    &lt;title&gt;Today's Horoscope - </w:t>
-      </w:r>
-      <w:proofErr w:type="spellStart"/>
-      <w:r>
-        <w:rPr>
-          <w:b w:val="0"/>
-          <w:bCs w:val="0"/>
-          <w:sz w:val="22"/>
-          <w:szCs w:val="22"/>
-        </w:rPr>
-        <w:t>StarVerse</w:t>
-      </w:r>
-      <w:proofErr w:type="spellEnd"/>
-      <w:r>
-        <w:rPr>
-          <w:b w:val="0"/>
-          <w:bCs w:val="0"/>
-          <w:sz w:val="22"/>
-          <w:szCs w:val="22"/>
-        </w:rPr>
-        <w:t>&lt;/title&gt;</w:t>
+        <w:t xml:space="preserve">    &lt;title&gt;Today's Horoscope - StarVerse&lt;/title&gt;</w:t>
       </w:r>
     </w:p>
     <w:p>
@@ -7131,17 +6258,7 @@
           <w:sz w:val="22"/>
           <w:szCs w:val="22"/>
         </w:rPr>
-        <w:t xml:space="preserve">            box-sizing: border-box</w:t>
-      </w:r>
-      <w:proofErr w:type="gramStart"/>
-      <w:r>
-        <w:rPr>
-          <w:b w:val="0"/>
-          <w:bCs w:val="0"/>
-          <w:sz w:val="22"/>
-          <w:szCs w:val="22"/>
-        </w:rPr>
-        <w:t>;</w:t>
+        <w:t xml:space="preserve">            box-sizing: border-box;</w:t>
       </w:r>
       <w:r>
         <w:rPr>
@@ -7161,7 +6278,6 @@
         </w:rPr>
         <w:t>}</w:t>
       </w:r>
-      <w:proofErr w:type="gramEnd"/>
     </w:p>
     <w:p>
       <w:pPr>
@@ -7435,27 +6551,7 @@
           <w:sz w:val="22"/>
           <w:szCs w:val="22"/>
         </w:rPr>
-        <w:t xml:space="preserve">            color: </w:t>
-      </w:r>
-      <w:proofErr w:type="gramStart"/>
-      <w:r>
-        <w:rPr>
-          <w:b w:val="0"/>
-          <w:bCs w:val="0"/>
-          <w:sz w:val="22"/>
-          <w:szCs w:val="22"/>
-        </w:rPr>
-        <w:t xml:space="preserve">white;   </w:t>
-      </w:r>
-      <w:proofErr w:type="gramEnd"/>
-      <w:r>
-        <w:rPr>
-          <w:b w:val="0"/>
-          <w:bCs w:val="0"/>
-          <w:sz w:val="22"/>
-          <w:szCs w:val="22"/>
-        </w:rPr>
-        <w:t>}</w:t>
+        <w:t xml:space="preserve">            color: white;   }</w:t>
       </w:r>
     </w:p>
     <w:p>
@@ -8063,27 +7159,7 @@
           <w:sz w:val="22"/>
           <w:szCs w:val="22"/>
         </w:rPr>
-        <w:t xml:space="preserve">            font-size: 24</w:t>
-      </w:r>
-      <w:proofErr w:type="gramStart"/>
-      <w:r>
-        <w:rPr>
-          <w:b w:val="0"/>
-          <w:bCs w:val="0"/>
-          <w:sz w:val="22"/>
-          <w:szCs w:val="22"/>
-        </w:rPr>
-        <w:t xml:space="preserve">px;   </w:t>
-      </w:r>
-      <w:proofErr w:type="gramEnd"/>
-      <w:r>
-        <w:rPr>
-          <w:b w:val="0"/>
-          <w:bCs w:val="0"/>
-          <w:sz w:val="22"/>
-          <w:szCs w:val="22"/>
-        </w:rPr>
-        <w:t xml:space="preserve"> }</w:t>
+        <w:t xml:space="preserve">            font-size: 24px;    }</w:t>
       </w:r>
     </w:p>
     <w:p>
@@ -8760,27 +7836,7 @@
           <w:szCs w:val="22"/>
         </w:rPr>
         <w:lastRenderedPageBreak/>
-        <w:t xml:space="preserve">  nav </w:t>
-      </w:r>
-      <w:proofErr w:type="gramStart"/>
-      <w:r>
-        <w:rPr>
-          <w:b w:val="0"/>
-          <w:bCs w:val="0"/>
-          <w:sz w:val="22"/>
-          <w:szCs w:val="22"/>
-        </w:rPr>
-        <w:t>a:hover</w:t>
-      </w:r>
-      <w:proofErr w:type="gramEnd"/>
-      <w:r>
-        <w:rPr>
-          <w:b w:val="0"/>
-          <w:bCs w:val="0"/>
-          <w:sz w:val="22"/>
-          <w:szCs w:val="22"/>
-        </w:rPr>
-        <w:t xml:space="preserve"> {</w:t>
+        <w:t xml:space="preserve">  nav a:hover {</w:t>
       </w:r>
     </w:p>
     <w:p>
@@ -9080,27 +8136,7 @@
           <w:sz w:val="22"/>
           <w:szCs w:val="22"/>
         </w:rPr>
-        <w:t xml:space="preserve">        &lt;h1&gt;</w:t>
-      </w:r>
-      <w:proofErr w:type="spellStart"/>
-      <w:r>
-        <w:rPr>
-          <w:b w:val="0"/>
-          <w:bCs w:val="0"/>
-          <w:sz w:val="22"/>
-          <w:szCs w:val="22"/>
-        </w:rPr>
-        <w:t>StarVerse</w:t>
-      </w:r>
-      <w:proofErr w:type="spellEnd"/>
-      <w:r>
-        <w:rPr>
-          <w:b w:val="0"/>
-          <w:bCs w:val="0"/>
-          <w:sz w:val="22"/>
-          <w:szCs w:val="22"/>
-        </w:rPr>
-        <w:t>&lt;/h1&gt;</w:t>
+        <w:t xml:space="preserve">        &lt;h1&gt;StarVerse&lt;/h1&gt;</w:t>
       </w:r>
     </w:p>
     <w:p>
@@ -9200,72 +8236,32 @@
           <w:sz w:val="22"/>
           <w:szCs w:val="22"/>
         </w:rPr>
-        <w:t xml:space="preserve">        &lt;a </w:t>
-      </w:r>
-      <w:proofErr w:type="spellStart"/>
-      <w:r>
-        <w:rPr>
-          <w:b w:val="0"/>
-          <w:bCs w:val="0"/>
-          <w:sz w:val="22"/>
-          <w:szCs w:val="22"/>
-        </w:rPr>
-        <w:t>href</w:t>
-      </w:r>
-      <w:proofErr w:type="spellEnd"/>
-      <w:r>
-        <w:rPr>
-          <w:b w:val="0"/>
-          <w:bCs w:val="0"/>
-          <w:sz w:val="22"/>
-          <w:szCs w:val="22"/>
-        </w:rPr>
-        <w:t>="index.html"&gt;Home&lt;/a&gt;</w:t>
-      </w:r>
-    </w:p>
-    <w:p>
-      <w:pPr>
-        <w:pStyle w:val="Heading1"/>
-        <w:tabs>
-          <w:tab w:val="left" w:pos="630"/>
-        </w:tabs>
-        <w:spacing w:before="242"/>
-        <w:ind w:left="630" w:firstLine="90"/>
-        <w:rPr>
-          <w:b w:val="0"/>
-          <w:bCs w:val="0"/>
-          <w:sz w:val="22"/>
-          <w:szCs w:val="22"/>
-        </w:rPr>
-      </w:pPr>
-      <w:r>
-        <w:rPr>
-          <w:b w:val="0"/>
-          <w:bCs w:val="0"/>
-          <w:sz w:val="22"/>
-          <w:szCs w:val="22"/>
-        </w:rPr>
-        <w:t xml:space="preserve">        &lt;a </w:t>
-      </w:r>
-      <w:proofErr w:type="spellStart"/>
-      <w:r>
-        <w:rPr>
-          <w:b w:val="0"/>
-          <w:bCs w:val="0"/>
-          <w:sz w:val="22"/>
-          <w:szCs w:val="22"/>
-        </w:rPr>
-        <w:t>href</w:t>
-      </w:r>
-      <w:proofErr w:type="spellEnd"/>
-      <w:r>
-        <w:rPr>
-          <w:b w:val="0"/>
-          <w:bCs w:val="0"/>
-          <w:sz w:val="22"/>
-          <w:szCs w:val="22"/>
-        </w:rPr>
-        <w:t>="horoscope.html"&gt;Today's Horoscope&lt;/a&gt;</w:t>
+        <w:t xml:space="preserve">        &lt;a href="index.html"&gt;Home&lt;/a&gt;</w:t>
+      </w:r>
+    </w:p>
+    <w:p>
+      <w:pPr>
+        <w:pStyle w:val="Heading1"/>
+        <w:tabs>
+          <w:tab w:val="left" w:pos="630"/>
+        </w:tabs>
+        <w:spacing w:before="242"/>
+        <w:ind w:left="630" w:firstLine="90"/>
+        <w:rPr>
+          <w:b w:val="0"/>
+          <w:bCs w:val="0"/>
+          <w:sz w:val="22"/>
+          <w:szCs w:val="22"/>
+        </w:rPr>
+      </w:pPr>
+      <w:r>
+        <w:rPr>
+          <w:b w:val="0"/>
+          <w:bCs w:val="0"/>
+          <w:sz w:val="22"/>
+          <w:szCs w:val="22"/>
+        </w:rPr>
+        <w:t xml:space="preserve">        &lt;a href="horoscope.html"&gt;Today's Horoscope&lt;/a&gt;</w:t>
       </w:r>
     </w:p>
     <w:p>
@@ -9381,27 +8377,7 @@
           <w:sz w:val="22"/>
           <w:szCs w:val="22"/>
         </w:rPr>
-        <w:t xml:space="preserve">        &lt;p&gt;Get your personalized horoscope reading for today. Find your zodiac sign and see what the stars have in store for </w:t>
-      </w:r>
-      <w:proofErr w:type="gramStart"/>
-      <w:r>
-        <w:rPr>
-          <w:b w:val="0"/>
-          <w:bCs w:val="0"/>
-          <w:sz w:val="22"/>
-          <w:szCs w:val="22"/>
-        </w:rPr>
-        <w:t>you!&lt;</w:t>
-      </w:r>
-      <w:proofErr w:type="gramEnd"/>
-      <w:r>
-        <w:rPr>
-          <w:b w:val="0"/>
-          <w:bCs w:val="0"/>
-          <w:sz w:val="22"/>
-          <w:szCs w:val="22"/>
-        </w:rPr>
-        <w:t>/p&gt;</w:t>
+        <w:t xml:space="preserve">        &lt;p&gt;Get your personalized horoscope reading for today. Find your zodiac sign and see what the stars have in store for you!&lt;/p&gt;</w:t>
       </w:r>
     </w:p>
     <w:p>
@@ -9476,27 +8452,7 @@
           <w:sz w:val="22"/>
           <w:szCs w:val="22"/>
         </w:rPr>
-        <w:t xml:space="preserve">        &lt;h3&gt;Aries (Mar 21 - Apr </w:t>
-      </w:r>
-      <w:proofErr w:type="gramStart"/>
-      <w:r>
-        <w:rPr>
-          <w:b w:val="0"/>
-          <w:bCs w:val="0"/>
-          <w:sz w:val="22"/>
-          <w:szCs w:val="22"/>
-        </w:rPr>
-        <w:t>19)&lt;</w:t>
-      </w:r>
-      <w:proofErr w:type="gramEnd"/>
-      <w:r>
-        <w:rPr>
-          <w:b w:val="0"/>
-          <w:bCs w:val="0"/>
-          <w:sz w:val="22"/>
-          <w:szCs w:val="22"/>
-        </w:rPr>
-        <w:t>/h3&gt;</w:t>
+        <w:t xml:space="preserve">        &lt;h3&gt;Aries (Mar 21 - Apr 19)&lt;/h3&gt;</w:t>
       </w:r>
     </w:p>
     <w:p>
@@ -9771,27 +8727,7 @@
           <w:szCs w:val="22"/>
         </w:rPr>
         <w:lastRenderedPageBreak/>
-        <w:t xml:space="preserve">speak </w:t>
-      </w:r>
-      <w:proofErr w:type="gramStart"/>
-      <w:r>
-        <w:rPr>
-          <w:b w:val="0"/>
-          <w:bCs w:val="0"/>
-          <w:sz w:val="22"/>
-          <w:szCs w:val="22"/>
-        </w:rPr>
-        <w:t>up.&lt;</w:t>
-      </w:r>
-      <w:proofErr w:type="gramEnd"/>
-      <w:r>
-        <w:rPr>
-          <w:b w:val="0"/>
-          <w:bCs w:val="0"/>
-          <w:sz w:val="22"/>
-          <w:szCs w:val="22"/>
-        </w:rPr>
-        <w:t>/p&gt;</w:t>
+        <w:t>speak up.&lt;/p&gt;</w:t>
       </w:r>
     </w:p>
     <w:p>
@@ -9891,72 +8827,32 @@
           <w:sz w:val="22"/>
           <w:szCs w:val="22"/>
         </w:rPr>
-        <w:t xml:space="preserve">        &lt;h3&gt;Taurus (Apr 20 - May </w:t>
-      </w:r>
-      <w:proofErr w:type="gramStart"/>
-      <w:r>
-        <w:rPr>
-          <w:b w:val="0"/>
-          <w:bCs w:val="0"/>
-          <w:sz w:val="22"/>
-          <w:szCs w:val="22"/>
-        </w:rPr>
-        <w:t>20)&lt;</w:t>
-      </w:r>
-      <w:proofErr w:type="gramEnd"/>
-      <w:r>
-        <w:rPr>
-          <w:b w:val="0"/>
-          <w:bCs w:val="0"/>
-          <w:sz w:val="22"/>
-          <w:szCs w:val="22"/>
-        </w:rPr>
-        <w:t>/h3&gt;</w:t>
-      </w:r>
-    </w:p>
-    <w:p>
-      <w:pPr>
-        <w:pStyle w:val="Heading1"/>
-        <w:tabs>
-          <w:tab w:val="left" w:pos="630"/>
-        </w:tabs>
-        <w:spacing w:before="242"/>
-        <w:ind w:left="630" w:firstLine="90"/>
-        <w:rPr>
-          <w:b w:val="0"/>
-          <w:bCs w:val="0"/>
-          <w:sz w:val="22"/>
-          <w:szCs w:val="22"/>
-        </w:rPr>
-      </w:pPr>
-      <w:r>
-        <w:rPr>
-          <w:b w:val="0"/>
-          <w:bCs w:val="0"/>
-          <w:sz w:val="22"/>
-          <w:szCs w:val="22"/>
-        </w:rPr>
-        <w:t xml:space="preserve">        &lt;p&gt;Financial stability is highlighted today. This is a good time to plan your budget and investments. A practical approach will serve you well. Don't rush into major decisions; take your </w:t>
-      </w:r>
-      <w:proofErr w:type="gramStart"/>
-      <w:r>
-        <w:rPr>
-          <w:b w:val="0"/>
-          <w:bCs w:val="0"/>
-          <w:sz w:val="22"/>
-          <w:szCs w:val="22"/>
-        </w:rPr>
-        <w:t>time.&lt;</w:t>
-      </w:r>
-      <w:proofErr w:type="gramEnd"/>
-      <w:r>
-        <w:rPr>
-          <w:b w:val="0"/>
-          <w:bCs w:val="0"/>
-          <w:sz w:val="22"/>
-          <w:szCs w:val="22"/>
-        </w:rPr>
-        <w:t>/p&gt;</w:t>
+        <w:t xml:space="preserve">        &lt;h3&gt;Taurus (Apr 20 - May 20)&lt;/h3&gt;</w:t>
+      </w:r>
+    </w:p>
+    <w:p>
+      <w:pPr>
+        <w:pStyle w:val="Heading1"/>
+        <w:tabs>
+          <w:tab w:val="left" w:pos="630"/>
+        </w:tabs>
+        <w:spacing w:before="242"/>
+        <w:ind w:left="630" w:firstLine="90"/>
+        <w:rPr>
+          <w:b w:val="0"/>
+          <w:bCs w:val="0"/>
+          <w:sz w:val="22"/>
+          <w:szCs w:val="22"/>
+        </w:rPr>
+      </w:pPr>
+      <w:r>
+        <w:rPr>
+          <w:b w:val="0"/>
+          <w:bCs w:val="0"/>
+          <w:sz w:val="22"/>
+          <w:szCs w:val="22"/>
+        </w:rPr>
+        <w:t xml:space="preserve">        &lt;p&gt;Financial stability is highlighted today. This is a good time to plan your budget and investments. A practical approach will serve you well. Don't rush into major decisions; take your time.&lt;/p&gt;</w:t>
       </w:r>
     </w:p>
     <w:p>
@@ -10072,72 +8968,32 @@
           <w:sz w:val="22"/>
           <w:szCs w:val="22"/>
         </w:rPr>
-        <w:t xml:space="preserve">        &lt;h3&gt;Gemini (May 21 - Jun </w:t>
-      </w:r>
-      <w:proofErr w:type="gramStart"/>
-      <w:r>
-        <w:rPr>
-          <w:b w:val="0"/>
-          <w:bCs w:val="0"/>
-          <w:sz w:val="22"/>
-          <w:szCs w:val="22"/>
-        </w:rPr>
-        <w:t>20)&lt;</w:t>
-      </w:r>
-      <w:proofErr w:type="gramEnd"/>
-      <w:r>
-        <w:rPr>
-          <w:b w:val="0"/>
-          <w:bCs w:val="0"/>
-          <w:sz w:val="22"/>
-          <w:szCs w:val="22"/>
-        </w:rPr>
-        <w:t>/h3&gt;</w:t>
-      </w:r>
-    </w:p>
-    <w:p>
-      <w:pPr>
-        <w:pStyle w:val="Heading1"/>
-        <w:tabs>
-          <w:tab w:val="left" w:pos="630"/>
-        </w:tabs>
-        <w:spacing w:before="242"/>
-        <w:ind w:left="630" w:firstLine="90"/>
-        <w:rPr>
-          <w:b w:val="0"/>
-          <w:bCs w:val="0"/>
-          <w:sz w:val="22"/>
-          <w:szCs w:val="22"/>
-        </w:rPr>
-      </w:pPr>
-      <w:r>
-        <w:rPr>
-          <w:b w:val="0"/>
-          <w:bCs w:val="0"/>
-          <w:sz w:val="22"/>
-          <w:szCs w:val="22"/>
-        </w:rPr>
-        <w:t xml:space="preserve">        &lt;p&gt;Communication is your strength today. A conversation with someone important could bring clarity and understanding. Share your ideas and listen to others. Networking may open new doors for </w:t>
-      </w:r>
-      <w:proofErr w:type="gramStart"/>
-      <w:r>
-        <w:rPr>
-          <w:b w:val="0"/>
-          <w:bCs w:val="0"/>
-          <w:sz w:val="22"/>
-          <w:szCs w:val="22"/>
-        </w:rPr>
-        <w:t>you.&lt;</w:t>
-      </w:r>
-      <w:proofErr w:type="gramEnd"/>
-      <w:r>
-        <w:rPr>
-          <w:b w:val="0"/>
-          <w:bCs w:val="0"/>
-          <w:sz w:val="22"/>
-          <w:szCs w:val="22"/>
-        </w:rPr>
-        <w:t>/p&gt;</w:t>
+        <w:t xml:space="preserve">        &lt;h3&gt;Gemini (May 21 - Jun 20)&lt;/h3&gt;</w:t>
+      </w:r>
+    </w:p>
+    <w:p>
+      <w:pPr>
+        <w:pStyle w:val="Heading1"/>
+        <w:tabs>
+          <w:tab w:val="left" w:pos="630"/>
+        </w:tabs>
+        <w:spacing w:before="242"/>
+        <w:ind w:left="630" w:firstLine="90"/>
+        <w:rPr>
+          <w:b w:val="0"/>
+          <w:bCs w:val="0"/>
+          <w:sz w:val="22"/>
+          <w:szCs w:val="22"/>
+        </w:rPr>
+      </w:pPr>
+      <w:r>
+        <w:rPr>
+          <w:b w:val="0"/>
+          <w:bCs w:val="0"/>
+          <w:sz w:val="22"/>
+          <w:szCs w:val="22"/>
+        </w:rPr>
+        <w:t xml:space="preserve">        &lt;p&gt;Communication is your strength today. A conversation with someone important could bring clarity and understanding. Share your ideas and listen to others. Networking may open new doors for you.&lt;/p&gt;</w:t>
       </w:r>
     </w:p>
     <w:p>
@@ -10237,72 +9093,32 @@
           <w:sz w:val="22"/>
           <w:szCs w:val="22"/>
         </w:rPr>
-        <w:t xml:space="preserve">        &lt;h3&gt;Cancer (Jun 21 - Jul </w:t>
-      </w:r>
-      <w:proofErr w:type="gramStart"/>
-      <w:r>
-        <w:rPr>
-          <w:b w:val="0"/>
-          <w:bCs w:val="0"/>
-          <w:sz w:val="22"/>
-          <w:szCs w:val="22"/>
-        </w:rPr>
-        <w:t>22)&lt;</w:t>
-      </w:r>
-      <w:proofErr w:type="gramEnd"/>
-      <w:r>
-        <w:rPr>
-          <w:b w:val="0"/>
-          <w:bCs w:val="0"/>
-          <w:sz w:val="22"/>
-          <w:szCs w:val="22"/>
-        </w:rPr>
-        <w:t>/h3&gt;</w:t>
-      </w:r>
-    </w:p>
-    <w:p>
-      <w:pPr>
-        <w:pStyle w:val="Heading1"/>
-        <w:tabs>
-          <w:tab w:val="left" w:pos="630"/>
-        </w:tabs>
-        <w:spacing w:before="242"/>
-        <w:ind w:left="630" w:firstLine="90"/>
-        <w:rPr>
-          <w:b w:val="0"/>
-          <w:bCs w:val="0"/>
-          <w:sz w:val="22"/>
-          <w:szCs w:val="22"/>
-        </w:rPr>
-      </w:pPr>
-      <w:r>
-        <w:rPr>
-          <w:b w:val="0"/>
-          <w:bCs w:val="0"/>
-          <w:sz w:val="22"/>
-          <w:szCs w:val="22"/>
-        </w:rPr>
-        <w:t xml:space="preserve">        &lt;p&gt;Focus on family and home today. It's a good time to spend quality time with loved ones. Emotional connections strengthen. Take care of yourself and create a peaceful </w:t>
-      </w:r>
-      <w:proofErr w:type="gramStart"/>
-      <w:r>
-        <w:rPr>
-          <w:b w:val="0"/>
-          <w:bCs w:val="0"/>
-          <w:sz w:val="22"/>
-          <w:szCs w:val="22"/>
-        </w:rPr>
-        <w:t>environment.&lt;</w:t>
-      </w:r>
-      <w:proofErr w:type="gramEnd"/>
-      <w:r>
-        <w:rPr>
-          <w:b w:val="0"/>
-          <w:bCs w:val="0"/>
-          <w:sz w:val="22"/>
-          <w:szCs w:val="22"/>
-        </w:rPr>
-        <w:t>/p&gt;</w:t>
+        <w:t xml:space="preserve">        &lt;h3&gt;Cancer (Jun 21 - Jul 22)&lt;/h3&gt;</w:t>
+      </w:r>
+    </w:p>
+    <w:p>
+      <w:pPr>
+        <w:pStyle w:val="Heading1"/>
+        <w:tabs>
+          <w:tab w:val="left" w:pos="630"/>
+        </w:tabs>
+        <w:spacing w:before="242"/>
+        <w:ind w:left="630" w:firstLine="90"/>
+        <w:rPr>
+          <w:b w:val="0"/>
+          <w:bCs w:val="0"/>
+          <w:sz w:val="22"/>
+          <w:szCs w:val="22"/>
+        </w:rPr>
+      </w:pPr>
+      <w:r>
+        <w:rPr>
+          <w:b w:val="0"/>
+          <w:bCs w:val="0"/>
+          <w:sz w:val="22"/>
+          <w:szCs w:val="22"/>
+        </w:rPr>
+        <w:t xml:space="preserve">        &lt;p&gt;Focus on family and home today. It's a good time to spend quality time with loved ones. Emotional connections strengthen. Take care of yourself and create a peaceful environment.&lt;/p&gt;</w:t>
       </w:r>
     </w:p>
     <w:p>
@@ -10418,72 +9234,32 @@
           <w:sz w:val="22"/>
           <w:szCs w:val="22"/>
         </w:rPr>
-        <w:t xml:space="preserve">        &lt;h3&gt;Leo (Jul 23 - Aug </w:t>
-      </w:r>
-      <w:proofErr w:type="gramStart"/>
-      <w:r>
-        <w:rPr>
-          <w:b w:val="0"/>
-          <w:bCs w:val="0"/>
-          <w:sz w:val="22"/>
-          <w:szCs w:val="22"/>
-        </w:rPr>
-        <w:t>22)&lt;</w:t>
-      </w:r>
-      <w:proofErr w:type="gramEnd"/>
-      <w:r>
-        <w:rPr>
-          <w:b w:val="0"/>
-          <w:bCs w:val="0"/>
-          <w:sz w:val="22"/>
-          <w:szCs w:val="22"/>
-        </w:rPr>
-        <w:t>/h3&gt;</w:t>
-      </w:r>
-    </w:p>
-    <w:p>
-      <w:pPr>
-        <w:pStyle w:val="Heading1"/>
-        <w:tabs>
-          <w:tab w:val="left" w:pos="630"/>
-        </w:tabs>
-        <w:spacing w:before="242"/>
-        <w:ind w:left="630" w:firstLine="90"/>
-        <w:rPr>
-          <w:b w:val="0"/>
-          <w:bCs w:val="0"/>
-          <w:sz w:val="22"/>
-          <w:szCs w:val="22"/>
-        </w:rPr>
-      </w:pPr>
-      <w:r>
-        <w:rPr>
-          <w:b w:val="0"/>
-          <w:bCs w:val="0"/>
-          <w:sz w:val="22"/>
-          <w:szCs w:val="22"/>
-        </w:rPr>
-        <w:t xml:space="preserve">        &lt;p&gt;Your creative energy is at its peak. This is the time to express yourself and share your talents with the world. A romantic opportunity may also arise. Shine bright and let your personality </w:t>
-      </w:r>
-      <w:proofErr w:type="gramStart"/>
-      <w:r>
-        <w:rPr>
-          <w:b w:val="0"/>
-          <w:bCs w:val="0"/>
-          <w:sz w:val="22"/>
-          <w:szCs w:val="22"/>
-        </w:rPr>
-        <w:t>radiate.&lt;</w:t>
-      </w:r>
-      <w:proofErr w:type="gramEnd"/>
-      <w:r>
-        <w:rPr>
-          <w:b w:val="0"/>
-          <w:bCs w:val="0"/>
-          <w:sz w:val="22"/>
-          <w:szCs w:val="22"/>
-        </w:rPr>
-        <w:t>/p&gt;</w:t>
+        <w:t xml:space="preserve">        &lt;h3&gt;Leo (Jul 23 - Aug 22)&lt;/h3&gt;</w:t>
+      </w:r>
+    </w:p>
+    <w:p>
+      <w:pPr>
+        <w:pStyle w:val="Heading1"/>
+        <w:tabs>
+          <w:tab w:val="left" w:pos="630"/>
+        </w:tabs>
+        <w:spacing w:before="242"/>
+        <w:ind w:left="630" w:firstLine="90"/>
+        <w:rPr>
+          <w:b w:val="0"/>
+          <w:bCs w:val="0"/>
+          <w:sz w:val="22"/>
+          <w:szCs w:val="22"/>
+        </w:rPr>
+      </w:pPr>
+      <w:r>
+        <w:rPr>
+          <w:b w:val="0"/>
+          <w:bCs w:val="0"/>
+          <w:sz w:val="22"/>
+          <w:szCs w:val="22"/>
+        </w:rPr>
+        <w:t xml:space="preserve">        &lt;p&gt;Your creative energy is at its peak. This is the time to express yourself and share your talents with the world. A romantic opportunity may also arise. Shine bright and let your personality radiate.&lt;/p&gt;</w:t>
       </w:r>
     </w:p>
     <w:p>
@@ -10852,72 +9628,32 @@
           <w:sz w:val="22"/>
           <w:szCs w:val="22"/>
         </w:rPr>
-        <w:t xml:space="preserve">        &lt;h3&gt;Virgo (Aug 23 - Sep </w:t>
-      </w:r>
-      <w:proofErr w:type="gramStart"/>
-      <w:r>
-        <w:rPr>
-          <w:b w:val="0"/>
-          <w:bCs w:val="0"/>
-          <w:sz w:val="22"/>
-          <w:szCs w:val="22"/>
-        </w:rPr>
-        <w:t>22)&lt;</w:t>
-      </w:r>
-      <w:proofErr w:type="gramEnd"/>
-      <w:r>
-        <w:rPr>
-          <w:b w:val="0"/>
-          <w:bCs w:val="0"/>
-          <w:sz w:val="22"/>
-          <w:szCs w:val="22"/>
-        </w:rPr>
-        <w:t>/h3&gt;</w:t>
-      </w:r>
-    </w:p>
-    <w:p>
-      <w:pPr>
-        <w:pStyle w:val="Heading1"/>
-        <w:tabs>
-          <w:tab w:val="left" w:pos="630"/>
-        </w:tabs>
-        <w:spacing w:before="242"/>
-        <w:ind w:left="630" w:firstLine="90"/>
-        <w:rPr>
-          <w:b w:val="0"/>
-          <w:bCs w:val="0"/>
-          <w:sz w:val="22"/>
-          <w:szCs w:val="22"/>
-        </w:rPr>
-      </w:pPr>
-      <w:r>
-        <w:rPr>
-          <w:b w:val="0"/>
-          <w:bCs w:val="0"/>
-          <w:sz w:val="22"/>
-          <w:szCs w:val="22"/>
-        </w:rPr>
-        <w:t xml:space="preserve">        &lt;p&gt;Health and wellness are in focus. Pay attention to your physical and mental well-being. Organize your schedule and create healthy habits. A quiet day at home is </w:t>
-      </w:r>
-      <w:proofErr w:type="gramStart"/>
-      <w:r>
-        <w:rPr>
-          <w:b w:val="0"/>
-          <w:bCs w:val="0"/>
-          <w:sz w:val="22"/>
-          <w:szCs w:val="22"/>
-        </w:rPr>
-        <w:t>recommended.&lt;</w:t>
-      </w:r>
-      <w:proofErr w:type="gramEnd"/>
-      <w:r>
-        <w:rPr>
-          <w:b w:val="0"/>
-          <w:bCs w:val="0"/>
-          <w:sz w:val="22"/>
-          <w:szCs w:val="22"/>
-        </w:rPr>
-        <w:t>/p&gt;</w:t>
+        <w:t xml:space="preserve">        &lt;h3&gt;Virgo (Aug 23 - Sep 22)&lt;/h3&gt;</w:t>
+      </w:r>
+    </w:p>
+    <w:p>
+      <w:pPr>
+        <w:pStyle w:val="Heading1"/>
+        <w:tabs>
+          <w:tab w:val="left" w:pos="630"/>
+        </w:tabs>
+        <w:spacing w:before="242"/>
+        <w:ind w:left="630" w:firstLine="90"/>
+        <w:rPr>
+          <w:b w:val="0"/>
+          <w:bCs w:val="0"/>
+          <w:sz w:val="22"/>
+          <w:szCs w:val="22"/>
+        </w:rPr>
+      </w:pPr>
+      <w:r>
+        <w:rPr>
+          <w:b w:val="0"/>
+          <w:bCs w:val="0"/>
+          <w:sz w:val="22"/>
+          <w:szCs w:val="22"/>
+        </w:rPr>
+        <w:t xml:space="preserve">        &lt;p&gt;Health and wellness are in focus. Pay attention to your physical and mental well-being. Organize your schedule and create healthy habits. A quiet day at home is recommended.&lt;/p&gt;</w:t>
       </w:r>
     </w:p>
     <w:p>
@@ -11033,72 +9769,32 @@
           <w:sz w:val="22"/>
           <w:szCs w:val="22"/>
         </w:rPr>
-        <w:t xml:space="preserve">        &lt;h3&gt;Libra (Sep 23 - Oct </w:t>
-      </w:r>
-      <w:proofErr w:type="gramStart"/>
-      <w:r>
-        <w:rPr>
-          <w:b w:val="0"/>
-          <w:bCs w:val="0"/>
-          <w:sz w:val="22"/>
-          <w:szCs w:val="22"/>
-        </w:rPr>
-        <w:t>22)&lt;</w:t>
-      </w:r>
-      <w:proofErr w:type="gramEnd"/>
-      <w:r>
-        <w:rPr>
-          <w:b w:val="0"/>
-          <w:bCs w:val="0"/>
-          <w:sz w:val="22"/>
-          <w:szCs w:val="22"/>
-        </w:rPr>
-        <w:t>/h3&gt;</w:t>
-      </w:r>
-    </w:p>
-    <w:p>
-      <w:pPr>
-        <w:pStyle w:val="Heading1"/>
-        <w:tabs>
-          <w:tab w:val="left" w:pos="630"/>
-        </w:tabs>
-        <w:spacing w:before="242"/>
-        <w:ind w:left="630" w:firstLine="90"/>
-        <w:rPr>
-          <w:b w:val="0"/>
-          <w:bCs w:val="0"/>
-          <w:sz w:val="22"/>
-          <w:szCs w:val="22"/>
-        </w:rPr>
-      </w:pPr>
-      <w:r>
-        <w:rPr>
-          <w:b w:val="0"/>
-          <w:bCs w:val="0"/>
-          <w:sz w:val="22"/>
-          <w:szCs w:val="22"/>
-        </w:rPr>
-        <w:t xml:space="preserve">        &lt;p&gt;Social interactions are highlighted. Friends and colleagues seek your company and advice. A fun event or gathering may bring joy. Balance your work and social </w:t>
-      </w:r>
-      <w:proofErr w:type="gramStart"/>
-      <w:r>
-        <w:rPr>
-          <w:b w:val="0"/>
-          <w:bCs w:val="0"/>
-          <w:sz w:val="22"/>
-          <w:szCs w:val="22"/>
-        </w:rPr>
-        <w:t>life.&lt;</w:t>
-      </w:r>
-      <w:proofErr w:type="gramEnd"/>
-      <w:r>
-        <w:rPr>
-          <w:b w:val="0"/>
-          <w:bCs w:val="0"/>
-          <w:sz w:val="22"/>
-          <w:szCs w:val="22"/>
-        </w:rPr>
-        <w:t>/p&gt;</w:t>
+        <w:t xml:space="preserve">        &lt;h3&gt;Libra (Sep 23 - Oct 22)&lt;/h3&gt;</w:t>
+      </w:r>
+    </w:p>
+    <w:p>
+      <w:pPr>
+        <w:pStyle w:val="Heading1"/>
+        <w:tabs>
+          <w:tab w:val="left" w:pos="630"/>
+        </w:tabs>
+        <w:spacing w:before="242"/>
+        <w:ind w:left="630" w:firstLine="90"/>
+        <w:rPr>
+          <w:b w:val="0"/>
+          <w:bCs w:val="0"/>
+          <w:sz w:val="22"/>
+          <w:szCs w:val="22"/>
+        </w:rPr>
+      </w:pPr>
+      <w:r>
+        <w:rPr>
+          <w:b w:val="0"/>
+          <w:bCs w:val="0"/>
+          <w:sz w:val="22"/>
+          <w:szCs w:val="22"/>
+        </w:rPr>
+        <w:t xml:space="preserve">        &lt;p&gt;Social interactions are highlighted. Friends and colleagues seek your company and advice. A fun event or gathering may bring joy. Balance your work and social life.&lt;/p&gt;</w:t>
       </w:r>
     </w:p>
     <w:p>
@@ -11214,72 +9910,32 @@
           <w:sz w:val="22"/>
           <w:szCs w:val="22"/>
         </w:rPr>
-        <w:t xml:space="preserve">        &lt;h3&gt;Scorpio (Oct 23 - Nov </w:t>
-      </w:r>
-      <w:proofErr w:type="gramStart"/>
-      <w:r>
-        <w:rPr>
-          <w:b w:val="0"/>
-          <w:bCs w:val="0"/>
-          <w:sz w:val="22"/>
-          <w:szCs w:val="22"/>
-        </w:rPr>
-        <w:t>21)&lt;</w:t>
-      </w:r>
-      <w:proofErr w:type="gramEnd"/>
-      <w:r>
-        <w:rPr>
-          <w:b w:val="0"/>
-          <w:bCs w:val="0"/>
-          <w:sz w:val="22"/>
-          <w:szCs w:val="22"/>
-        </w:rPr>
-        <w:t>/h3&gt;</w:t>
-      </w:r>
-    </w:p>
-    <w:p>
-      <w:pPr>
-        <w:pStyle w:val="Heading1"/>
-        <w:tabs>
-          <w:tab w:val="left" w:pos="630"/>
-        </w:tabs>
-        <w:spacing w:before="242"/>
-        <w:ind w:left="630" w:firstLine="90"/>
-        <w:rPr>
-          <w:b w:val="0"/>
-          <w:bCs w:val="0"/>
-          <w:sz w:val="22"/>
-          <w:szCs w:val="22"/>
-        </w:rPr>
-      </w:pPr>
-      <w:r>
-        <w:rPr>
-          <w:b w:val="0"/>
-          <w:bCs w:val="0"/>
-          <w:sz w:val="22"/>
-          <w:szCs w:val="22"/>
-        </w:rPr>
-        <w:t xml:space="preserve">        &lt;p&gt;Professional achievements are possible today. Your hard work may be recognized and rewarded. Focus on your career goals. A promotion or new opportunity could come your </w:t>
-      </w:r>
-      <w:proofErr w:type="gramStart"/>
-      <w:r>
-        <w:rPr>
-          <w:b w:val="0"/>
-          <w:bCs w:val="0"/>
-          <w:sz w:val="22"/>
-          <w:szCs w:val="22"/>
-        </w:rPr>
-        <w:t>way.&lt;</w:t>
-      </w:r>
-      <w:proofErr w:type="gramEnd"/>
-      <w:r>
-        <w:rPr>
-          <w:b w:val="0"/>
-          <w:bCs w:val="0"/>
-          <w:sz w:val="22"/>
-          <w:szCs w:val="22"/>
-        </w:rPr>
-        <w:t>/p&gt;</w:t>
+        <w:t xml:space="preserve">        &lt;h3&gt;Scorpio (Oct 23 - Nov 21)&lt;/h3&gt;</w:t>
+      </w:r>
+    </w:p>
+    <w:p>
+      <w:pPr>
+        <w:pStyle w:val="Heading1"/>
+        <w:tabs>
+          <w:tab w:val="left" w:pos="630"/>
+        </w:tabs>
+        <w:spacing w:before="242"/>
+        <w:ind w:left="630" w:firstLine="90"/>
+        <w:rPr>
+          <w:b w:val="0"/>
+          <w:bCs w:val="0"/>
+          <w:sz w:val="22"/>
+          <w:szCs w:val="22"/>
+        </w:rPr>
+      </w:pPr>
+      <w:r>
+        <w:rPr>
+          <w:b w:val="0"/>
+          <w:bCs w:val="0"/>
+          <w:sz w:val="22"/>
+          <w:szCs w:val="22"/>
+        </w:rPr>
+        <w:t xml:space="preserve">        &lt;p&gt;Professional achievements are possible today. Your hard work may be recognized and rewarded. Focus on your career goals. A promotion or new opportunity could come your way.&lt;/p&gt;</w:t>
       </w:r>
     </w:p>
     <w:p>
@@ -11395,72 +10051,32 @@
           <w:sz w:val="22"/>
           <w:szCs w:val="22"/>
         </w:rPr>
-        <w:t xml:space="preserve">        &lt;h3&gt;Sagittarius (Nov 22 - Dec </w:t>
-      </w:r>
-      <w:proofErr w:type="gramStart"/>
-      <w:r>
-        <w:rPr>
-          <w:b w:val="0"/>
-          <w:bCs w:val="0"/>
-          <w:sz w:val="22"/>
-          <w:szCs w:val="22"/>
-        </w:rPr>
-        <w:t>21)&lt;</w:t>
-      </w:r>
-      <w:proofErr w:type="gramEnd"/>
-      <w:r>
-        <w:rPr>
-          <w:b w:val="0"/>
-          <w:bCs w:val="0"/>
-          <w:sz w:val="22"/>
-          <w:szCs w:val="22"/>
-        </w:rPr>
-        <w:t>/h3&gt;</w:t>
-      </w:r>
-    </w:p>
-    <w:p>
-      <w:pPr>
-        <w:pStyle w:val="Heading1"/>
-        <w:tabs>
-          <w:tab w:val="left" w:pos="630"/>
-        </w:tabs>
-        <w:spacing w:before="242"/>
-        <w:ind w:left="630" w:firstLine="90"/>
-        <w:rPr>
-          <w:b w:val="0"/>
-          <w:bCs w:val="0"/>
-          <w:sz w:val="22"/>
-          <w:szCs w:val="22"/>
-        </w:rPr>
-      </w:pPr>
-      <w:r>
-        <w:rPr>
-          <w:b w:val="0"/>
-          <w:bCs w:val="0"/>
-          <w:sz w:val="22"/>
-          <w:szCs w:val="22"/>
-        </w:rPr>
-        <w:t xml:space="preserve">        &lt;p&gt;Adventure and learning are calling. Travel, study, or explore new ideas. Expand your horizons and seek knowledge. An exciting opportunity for personal growth awaits </w:t>
-      </w:r>
-      <w:proofErr w:type="gramStart"/>
-      <w:r>
-        <w:rPr>
-          <w:b w:val="0"/>
-          <w:bCs w:val="0"/>
-          <w:sz w:val="22"/>
-          <w:szCs w:val="22"/>
-        </w:rPr>
-        <w:t>you.&lt;</w:t>
-      </w:r>
-      <w:proofErr w:type="gramEnd"/>
-      <w:r>
-        <w:rPr>
-          <w:b w:val="0"/>
-          <w:bCs w:val="0"/>
-          <w:sz w:val="22"/>
-          <w:szCs w:val="22"/>
-        </w:rPr>
-        <w:t>/p&gt;</w:t>
+        <w:t xml:space="preserve">        &lt;h3&gt;Sagittarius (Nov 22 - Dec 21)&lt;/h3&gt;</w:t>
+      </w:r>
+    </w:p>
+    <w:p>
+      <w:pPr>
+        <w:pStyle w:val="Heading1"/>
+        <w:tabs>
+          <w:tab w:val="left" w:pos="630"/>
+        </w:tabs>
+        <w:spacing w:before="242"/>
+        <w:ind w:left="630" w:firstLine="90"/>
+        <w:rPr>
+          <w:b w:val="0"/>
+          <w:bCs w:val="0"/>
+          <w:sz w:val="22"/>
+          <w:szCs w:val="22"/>
+        </w:rPr>
+      </w:pPr>
+      <w:r>
+        <w:rPr>
+          <w:b w:val="0"/>
+          <w:bCs w:val="0"/>
+          <w:sz w:val="22"/>
+          <w:szCs w:val="22"/>
+        </w:rPr>
+        <w:t xml:space="preserve">        &lt;p&gt;Adventure and learning are calling. Travel, study, or explore new ideas. Expand your horizons and seek knowledge. An exciting opportunity for personal growth awaits you.&lt;/p&gt;</w:t>
       </w:r>
     </w:p>
     <w:p>
@@ -11601,15 +10217,7 @@
                                   <w:spacing w:val="-10"/>
                                   <w:sz w:val="24"/>
                                 </w:rPr>
-                                <w:t>1</w:t>
-                              </w:r>
-                              <w:r>
-                                <w:rPr>
-                                  <w:color w:val="000000"/>
-                                  <w:spacing w:val="-10"/>
-                                  <w:sz w:val="24"/>
-                                </w:rPr>
-                                <w:t>2</w:t>
+                                <w:t>12</w:t>
                               </w:r>
                             </w:p>
                           </w:txbxContent>
@@ -11824,72 +10432,32 @@
           <w:szCs w:val="22"/>
         </w:rPr>
         <w:lastRenderedPageBreak/>
-        <w:t xml:space="preserve">        &lt;h3&gt;Capricorn (Dec 22 - Jan </w:t>
-      </w:r>
-      <w:proofErr w:type="gramStart"/>
-      <w:r>
-        <w:rPr>
-          <w:b w:val="0"/>
-          <w:bCs w:val="0"/>
-          <w:sz w:val="22"/>
-          <w:szCs w:val="22"/>
-        </w:rPr>
-        <w:t>19)&lt;</w:t>
-      </w:r>
-      <w:proofErr w:type="gramEnd"/>
-      <w:r>
-        <w:rPr>
-          <w:b w:val="0"/>
-          <w:bCs w:val="0"/>
-          <w:sz w:val="22"/>
-          <w:szCs w:val="22"/>
-        </w:rPr>
-        <w:t>/h3&gt;</w:t>
-      </w:r>
-    </w:p>
-    <w:p>
-      <w:pPr>
-        <w:pStyle w:val="Heading1"/>
-        <w:tabs>
-          <w:tab w:val="left" w:pos="630"/>
-        </w:tabs>
-        <w:spacing w:before="242"/>
-        <w:ind w:left="630" w:firstLine="90"/>
-        <w:rPr>
-          <w:b w:val="0"/>
-          <w:bCs w:val="0"/>
-          <w:sz w:val="22"/>
-          <w:szCs w:val="22"/>
-        </w:rPr>
-      </w:pPr>
-      <w:r>
-        <w:rPr>
-          <w:b w:val="0"/>
-          <w:bCs w:val="0"/>
-          <w:sz w:val="22"/>
-          <w:szCs w:val="22"/>
-        </w:rPr>
-        <w:t xml:space="preserve">        &lt;p&gt;Financial matters improve. Investments may yield positive returns. Plan strategically for the future. A practical approach to money will benefit you. Avoid impulse </w:t>
-      </w:r>
-      <w:proofErr w:type="gramStart"/>
-      <w:r>
-        <w:rPr>
-          <w:b w:val="0"/>
-          <w:bCs w:val="0"/>
-          <w:sz w:val="22"/>
-          <w:szCs w:val="22"/>
-        </w:rPr>
-        <w:t>spending.&lt;</w:t>
-      </w:r>
-      <w:proofErr w:type="gramEnd"/>
-      <w:r>
-        <w:rPr>
-          <w:b w:val="0"/>
-          <w:bCs w:val="0"/>
-          <w:sz w:val="22"/>
-          <w:szCs w:val="22"/>
-        </w:rPr>
-        <w:t>/p&gt;</w:t>
+        <w:t xml:space="preserve">        &lt;h3&gt;Capricorn (Dec 22 - Jan 19)&lt;/h3&gt;</w:t>
+      </w:r>
+    </w:p>
+    <w:p>
+      <w:pPr>
+        <w:pStyle w:val="Heading1"/>
+        <w:tabs>
+          <w:tab w:val="left" w:pos="630"/>
+        </w:tabs>
+        <w:spacing w:before="242"/>
+        <w:ind w:left="630" w:firstLine="90"/>
+        <w:rPr>
+          <w:b w:val="0"/>
+          <w:bCs w:val="0"/>
+          <w:sz w:val="22"/>
+          <w:szCs w:val="22"/>
+        </w:rPr>
+      </w:pPr>
+      <w:r>
+        <w:rPr>
+          <w:b w:val="0"/>
+          <w:bCs w:val="0"/>
+          <w:sz w:val="22"/>
+          <w:szCs w:val="22"/>
+        </w:rPr>
+        <w:t xml:space="preserve">        &lt;p&gt;Financial matters improve. Investments may yield positive returns. Plan strategically for the future. A practical approach to money will benefit you. Avoid impulse spending.&lt;/p&gt;</w:t>
       </w:r>
     </w:p>
     <w:p>
@@ -12005,72 +10573,32 @@
           <w:sz w:val="22"/>
           <w:szCs w:val="22"/>
         </w:rPr>
-        <w:t xml:space="preserve">        &lt;h3&gt;Aquarius (Jan 20 - Feb </w:t>
-      </w:r>
-      <w:proofErr w:type="gramStart"/>
-      <w:r>
-        <w:rPr>
-          <w:b w:val="0"/>
-          <w:bCs w:val="0"/>
-          <w:sz w:val="22"/>
-          <w:szCs w:val="22"/>
-        </w:rPr>
-        <w:t>18)&lt;</w:t>
-      </w:r>
-      <w:proofErr w:type="gramEnd"/>
-      <w:r>
-        <w:rPr>
-          <w:b w:val="0"/>
-          <w:bCs w:val="0"/>
-          <w:sz w:val="22"/>
-          <w:szCs w:val="22"/>
-        </w:rPr>
-        <w:t>/h3&gt;</w:t>
-      </w:r>
-    </w:p>
-    <w:p>
-      <w:pPr>
-        <w:pStyle w:val="Heading1"/>
-        <w:tabs>
-          <w:tab w:val="left" w:pos="630"/>
-        </w:tabs>
-        <w:spacing w:before="242"/>
-        <w:ind w:left="630" w:firstLine="90"/>
-        <w:rPr>
-          <w:b w:val="0"/>
-          <w:bCs w:val="0"/>
-          <w:sz w:val="22"/>
-          <w:szCs w:val="22"/>
-        </w:rPr>
-      </w:pPr>
-      <w:r>
-        <w:rPr>
-          <w:b w:val="0"/>
-          <w:bCs w:val="0"/>
-          <w:sz w:val="22"/>
-          <w:szCs w:val="22"/>
-        </w:rPr>
-        <w:t xml:space="preserve">        &lt;p&gt;Relationships take center stage. Strengthen bonds with loved ones. A meaningful conversation or romantic moment is possible. Collaborate with others to achieve shared </w:t>
-      </w:r>
-      <w:proofErr w:type="gramStart"/>
-      <w:r>
-        <w:rPr>
-          <w:b w:val="0"/>
-          <w:bCs w:val="0"/>
-          <w:sz w:val="22"/>
-          <w:szCs w:val="22"/>
-        </w:rPr>
-        <w:t>goals.&lt;</w:t>
-      </w:r>
-      <w:proofErr w:type="gramEnd"/>
-      <w:r>
-        <w:rPr>
-          <w:b w:val="0"/>
-          <w:bCs w:val="0"/>
-          <w:sz w:val="22"/>
-          <w:szCs w:val="22"/>
-        </w:rPr>
-        <w:t>/p&gt;</w:t>
+        <w:t xml:space="preserve">        &lt;h3&gt;Aquarius (Jan 20 - Feb 18)&lt;/h3&gt;</w:t>
+      </w:r>
+    </w:p>
+    <w:p>
+      <w:pPr>
+        <w:pStyle w:val="Heading1"/>
+        <w:tabs>
+          <w:tab w:val="left" w:pos="630"/>
+        </w:tabs>
+        <w:spacing w:before="242"/>
+        <w:ind w:left="630" w:firstLine="90"/>
+        <w:rPr>
+          <w:b w:val="0"/>
+          <w:bCs w:val="0"/>
+          <w:sz w:val="22"/>
+          <w:szCs w:val="22"/>
+        </w:rPr>
+      </w:pPr>
+      <w:r>
+        <w:rPr>
+          <w:b w:val="0"/>
+          <w:bCs w:val="0"/>
+          <w:sz w:val="22"/>
+          <w:szCs w:val="22"/>
+        </w:rPr>
+        <w:t xml:space="preserve">        &lt;p&gt;Relationships take center stage. Strengthen bonds with loved ones. A meaningful conversation or romantic moment is possible. Collaborate with others to achieve shared goals.&lt;/p&gt;</w:t>
       </w:r>
     </w:p>
     <w:p>
@@ -12170,72 +10698,32 @@
           <w:sz w:val="22"/>
           <w:szCs w:val="22"/>
         </w:rPr>
-        <w:t xml:space="preserve">        &lt;h3&gt;Pisces (Feb 19 - Mar </w:t>
-      </w:r>
-      <w:proofErr w:type="gramStart"/>
-      <w:r>
-        <w:rPr>
-          <w:b w:val="0"/>
-          <w:bCs w:val="0"/>
-          <w:sz w:val="22"/>
-          <w:szCs w:val="22"/>
-        </w:rPr>
-        <w:t>20)&lt;</w:t>
-      </w:r>
-      <w:proofErr w:type="gramEnd"/>
-      <w:r>
-        <w:rPr>
-          <w:b w:val="0"/>
-          <w:bCs w:val="0"/>
-          <w:sz w:val="22"/>
-          <w:szCs w:val="22"/>
-        </w:rPr>
-        <w:t>/h3&gt;</w:t>
-      </w:r>
-    </w:p>
-    <w:p>
-      <w:pPr>
-        <w:pStyle w:val="Heading1"/>
-        <w:tabs>
-          <w:tab w:val="left" w:pos="630"/>
-        </w:tabs>
-        <w:spacing w:before="242"/>
-        <w:ind w:left="630" w:firstLine="90"/>
-        <w:rPr>
-          <w:b w:val="0"/>
-          <w:bCs w:val="0"/>
-          <w:sz w:val="22"/>
-          <w:szCs w:val="22"/>
-        </w:rPr>
-      </w:pPr>
-      <w:r>
-        <w:rPr>
-          <w:b w:val="0"/>
-          <w:bCs w:val="0"/>
-          <w:sz w:val="22"/>
-          <w:szCs w:val="22"/>
-        </w:rPr>
-        <w:t xml:space="preserve">        &lt;p&gt;Creativity and intuition guide you today. Trust your inner voice and follow your dreams. A spiritual or artistic pursuit brings fulfillment. Self-expression is powerful </w:t>
-      </w:r>
-      <w:proofErr w:type="gramStart"/>
-      <w:r>
-        <w:rPr>
-          <w:b w:val="0"/>
-          <w:bCs w:val="0"/>
-          <w:sz w:val="22"/>
-          <w:szCs w:val="22"/>
-        </w:rPr>
-        <w:t>now.&lt;</w:t>
-      </w:r>
-      <w:proofErr w:type="gramEnd"/>
-      <w:r>
-        <w:rPr>
-          <w:b w:val="0"/>
-          <w:bCs w:val="0"/>
-          <w:sz w:val="22"/>
-          <w:szCs w:val="22"/>
-        </w:rPr>
-        <w:t>/p&gt;</w:t>
+        <w:t xml:space="preserve">        &lt;h3&gt;Pisces (Feb 19 - Mar 20)&lt;/h3&gt;</w:t>
+      </w:r>
+    </w:p>
+    <w:p>
+      <w:pPr>
+        <w:pStyle w:val="Heading1"/>
+        <w:tabs>
+          <w:tab w:val="left" w:pos="630"/>
+        </w:tabs>
+        <w:spacing w:before="242"/>
+        <w:ind w:left="630" w:firstLine="90"/>
+        <w:rPr>
+          <w:b w:val="0"/>
+          <w:bCs w:val="0"/>
+          <w:sz w:val="22"/>
+          <w:szCs w:val="22"/>
+        </w:rPr>
+      </w:pPr>
+      <w:r>
+        <w:rPr>
+          <w:b w:val="0"/>
+          <w:bCs w:val="0"/>
+          <w:sz w:val="22"/>
+          <w:szCs w:val="22"/>
+        </w:rPr>
+        <w:t xml:space="preserve">        &lt;p&gt;Creativity and intuition guide you today. Trust your inner voice and follow your dreams. A spiritual or artistic pursuit brings fulfillment. Self-expression is powerful now.&lt;/p&gt;</w:t>
       </w:r>
     </w:p>
     <w:p>
@@ -12712,10 +11200,7 @@
         </mc:AlternateContent>
       </w:r>
       <w:r>
-        <w:t xml:space="preserve">                                                                                  </w:t>
-      </w:r>
-      <w:r>
-        <w:t xml:space="preserve">Ex. 1 | </w:t>
+        <w:t xml:space="preserve">                                                                                  Ex. 1 | </w:t>
       </w:r>
       <w:r>
         <w:rPr>
@@ -12862,157 +11347,57 @@
           <w:sz w:val="22"/>
           <w:szCs w:val="22"/>
         </w:rPr>
-        <w:t xml:space="preserve">        &lt;p&gt;&amp;copy; 2024 </w:t>
-      </w:r>
-      <w:proofErr w:type="spellStart"/>
-      <w:r>
-        <w:rPr>
-          <w:b w:val="0"/>
-          <w:bCs w:val="0"/>
-          <w:sz w:val="22"/>
-          <w:szCs w:val="22"/>
-        </w:rPr>
-        <w:t>StarVerse</w:t>
-      </w:r>
-      <w:proofErr w:type="spellEnd"/>
-      <w:r>
-        <w:rPr>
-          <w:b w:val="0"/>
-          <w:bCs w:val="0"/>
-          <w:sz w:val="22"/>
-          <w:szCs w:val="22"/>
-        </w:rPr>
-        <w:t xml:space="preserve">. All rights </w:t>
-      </w:r>
-      <w:proofErr w:type="gramStart"/>
-      <w:r>
-        <w:rPr>
-          <w:b w:val="0"/>
-          <w:bCs w:val="0"/>
-          <w:sz w:val="22"/>
-          <w:szCs w:val="22"/>
-        </w:rPr>
-        <w:t>reserved.&lt;</w:t>
-      </w:r>
-      <w:proofErr w:type="gramEnd"/>
-      <w:r>
-        <w:rPr>
-          <w:b w:val="0"/>
-          <w:bCs w:val="0"/>
-          <w:sz w:val="22"/>
-          <w:szCs w:val="22"/>
-        </w:rPr>
-        <w:t>/p&gt;</w:t>
-      </w:r>
-    </w:p>
-    <w:p>
-      <w:pPr>
-        <w:pStyle w:val="Heading1"/>
-        <w:tabs>
-          <w:tab w:val="left" w:pos="630"/>
-        </w:tabs>
-        <w:spacing w:before="242"/>
-        <w:ind w:left="630" w:firstLine="90"/>
-        <w:rPr>
-          <w:b w:val="0"/>
-          <w:bCs w:val="0"/>
-          <w:sz w:val="22"/>
-          <w:szCs w:val="22"/>
-        </w:rPr>
-      </w:pPr>
-      <w:r>
-        <w:rPr>
-          <w:b w:val="0"/>
-          <w:bCs w:val="0"/>
-          <w:sz w:val="22"/>
-          <w:szCs w:val="22"/>
-        </w:rPr>
-        <w:t xml:space="preserve">        &lt;p&gt;Email: &lt;a </w:t>
-      </w:r>
-      <w:proofErr w:type="spellStart"/>
-      <w:r>
-        <w:rPr>
-          <w:b w:val="0"/>
-          <w:bCs w:val="0"/>
-          <w:sz w:val="22"/>
-          <w:szCs w:val="22"/>
-        </w:rPr>
-        <w:t>href</w:t>
-      </w:r>
-      <w:proofErr w:type="spellEnd"/>
-      <w:r>
-        <w:rPr>
-          <w:b w:val="0"/>
-          <w:bCs w:val="0"/>
-          <w:sz w:val="22"/>
-          <w:szCs w:val="22"/>
-        </w:rPr>
-        <w:t>="mailto:info@starverse.com"&gt;info@starverse.com&lt;/a&gt;&lt;/p&gt;</w:t>
-      </w:r>
-    </w:p>
-    <w:p>
-      <w:pPr>
-        <w:pStyle w:val="Heading1"/>
-        <w:tabs>
-          <w:tab w:val="left" w:pos="630"/>
-        </w:tabs>
-        <w:spacing w:before="242"/>
-        <w:ind w:left="630" w:firstLine="90"/>
-        <w:rPr>
-          <w:b w:val="0"/>
-          <w:bCs w:val="0"/>
-          <w:sz w:val="22"/>
-          <w:szCs w:val="22"/>
-        </w:rPr>
-      </w:pPr>
-      <w:r>
-        <w:rPr>
-          <w:b w:val="0"/>
-          <w:bCs w:val="0"/>
-          <w:sz w:val="22"/>
-          <w:szCs w:val="22"/>
-        </w:rPr>
-        <w:t xml:space="preserve">        &lt;p&gt;&lt;</w:t>
-      </w:r>
-      <w:proofErr w:type="spellStart"/>
-      <w:r>
-        <w:rPr>
-          <w:b w:val="0"/>
-          <w:bCs w:val="0"/>
-          <w:sz w:val="22"/>
-          <w:szCs w:val="22"/>
-        </w:rPr>
-        <w:t>em</w:t>
-      </w:r>
-      <w:proofErr w:type="spellEnd"/>
-      <w:r>
-        <w:rPr>
-          <w:b w:val="0"/>
-          <w:bCs w:val="0"/>
-          <w:sz w:val="22"/>
-          <w:szCs w:val="22"/>
-        </w:rPr>
-        <w:t>&gt;"Every day brings new cosmic possibilities."&lt;/</w:t>
-      </w:r>
-      <w:proofErr w:type="spellStart"/>
-      <w:r>
-        <w:rPr>
-          <w:b w:val="0"/>
-          <w:bCs w:val="0"/>
-          <w:sz w:val="22"/>
-          <w:szCs w:val="22"/>
-        </w:rPr>
-        <w:t>em</w:t>
-      </w:r>
-      <w:proofErr w:type="spellEnd"/>
-      <w:r>
-        <w:rPr>
-          <w:b w:val="0"/>
-          <w:bCs w:val="0"/>
-          <w:sz w:val="22"/>
-          <w:szCs w:val="22"/>
-        </w:rPr>
-        <w:t>&gt;&lt;/p&gt;</w:t>
+        <w:t xml:space="preserve">        &lt;p&gt;&amp;copy; 2024 StarVerse. All rights reserved.&lt;/p&gt;</w:t>
+      </w:r>
+    </w:p>
+    <w:p>
+      <w:pPr>
+        <w:pStyle w:val="Heading1"/>
+        <w:tabs>
+          <w:tab w:val="left" w:pos="630"/>
+        </w:tabs>
+        <w:spacing w:before="242"/>
+        <w:ind w:left="630" w:firstLine="90"/>
+        <w:rPr>
+          <w:b w:val="0"/>
+          <w:bCs w:val="0"/>
+          <w:sz w:val="22"/>
+          <w:szCs w:val="22"/>
+        </w:rPr>
+      </w:pPr>
+      <w:r>
+        <w:rPr>
+          <w:b w:val="0"/>
+          <w:bCs w:val="0"/>
+          <w:sz w:val="22"/>
+          <w:szCs w:val="22"/>
+        </w:rPr>
+        <w:t xml:space="preserve">        &lt;p&gt;Email: &lt;a href="mailto:info@starverse.com"&gt;info@starverse.com&lt;/a&gt;&lt;/p&gt;</w:t>
+      </w:r>
+    </w:p>
+    <w:p>
+      <w:pPr>
+        <w:pStyle w:val="Heading1"/>
+        <w:tabs>
+          <w:tab w:val="left" w:pos="630"/>
+        </w:tabs>
+        <w:spacing w:before="242"/>
+        <w:ind w:left="630" w:firstLine="90"/>
+        <w:rPr>
+          <w:b w:val="0"/>
+          <w:bCs w:val="0"/>
+          <w:sz w:val="22"/>
+          <w:szCs w:val="22"/>
+        </w:rPr>
+      </w:pPr>
+      <w:r>
+        <w:rPr>
+          <w:b w:val="0"/>
+          <w:bCs w:val="0"/>
+          <w:sz w:val="22"/>
+          <w:szCs w:val="22"/>
+        </w:rPr>
+        <w:t xml:space="preserve">        &lt;p&gt;&lt;em&gt;"Every day brings new cosmic possibilities."&lt;/em&gt;&lt;/p&gt;</w:t>
       </w:r>
     </w:p>
     <w:p>
@@ -13212,7 +11597,7 @@
                       </wpg:cNvGrpSpPr>
                       <wpg:grpSpPr>
                         <a:xfrm>
-                          <a:off x="0" y="3175"/>
+                          <a:off x="0" y="0"/>
                           <a:ext cx="5943600" cy="269875"/>
                           <a:chOff x="0" y="3175"/>
                           <a:chExt cx="5943600" cy="269875"/>
@@ -13386,10 +11771,7 @@
         </mc:AlternateContent>
       </w:r>
       <w:r>
-        <w:t xml:space="preserve">                                                                                </w:t>
-      </w:r>
-      <w:r>
-        <w:t xml:space="preserve">Ex. 1 | </w:t>
+        <w:t xml:space="preserve">                                                                                Ex. 1 | </w:t>
       </w:r>
       <w:r>
         <w:rPr>
@@ -13523,14 +11905,8 @@
         <w:t xml:space="preserve">     </w:t>
       </w:r>
       <w:r>
-        <w:t xml:space="preserve">Thus, the HTML5 website </w:t>
-      </w:r>
-      <w:proofErr w:type="spellStart"/>
-      <w:proofErr w:type="gramStart"/>
-      <w:r>
-        <w:t>StarVerse</w:t>
-      </w:r>
-      <w:proofErr w:type="spellEnd"/>
+        <w:t>Thus, the HTML5 website StarVerse</w:t>
+      </w:r>
       <w:r>
         <w:rPr>
           <w:b/>
@@ -13539,11 +11915,7 @@
         <w:t xml:space="preserve"> </w:t>
       </w:r>
       <w:r>
-        <w:t xml:space="preserve"> was</w:t>
-      </w:r>
-      <w:proofErr w:type="gramEnd"/>
-      <w:r>
-        <w:t xml:space="preserve"> successfully designed and developed using HTML5 semantic elements, tables, lists, hyperlinks, and CSS styling. The website executed successfully and the output was verified in a web browser.</w:t>
+        <w:t xml:space="preserve"> was successfully designed and developed using HTML5 semantic elements, tables, lists, hyperlinks, and CSS styling. The website executed successfully and the output was verified in a web browser.</w:t>
       </w:r>
     </w:p>
     <w:p>
@@ -13626,7 +11998,7 @@
                       </wpg:cNvGrpSpPr>
                       <wpg:grpSpPr>
                         <a:xfrm>
-                          <a:off x="0" y="3175"/>
+                          <a:off x="0" y="0"/>
                           <a:ext cx="5943600" cy="269875"/>
                           <a:chOff x="0" y="3175"/>
                           <a:chExt cx="5943600" cy="269875"/>
@@ -13816,10 +12188,7 @@
         </mc:AlternateContent>
       </w:r>
       <w:r>
-        <w:t xml:space="preserve">                                                                                       </w:t>
-      </w:r>
-      <w:r>
-        <w:t xml:space="preserve">Ex. 1 | </w:t>
+        <w:t xml:space="preserve">                                                                                       Ex. 1 | </w:t>
       </w:r>
       <w:r>
         <w:rPr>
@@ -15528,6 +13897,7 @@
   <w:style w:type="character" w:default="1" w:styleId="DefaultParagraphFont">
     <w:name w:val="Default Paragraph Font"/>
     <w:uiPriority w:val="1"/>
+    <w:semiHidden/>
     <w:unhideWhenUsed/>
   </w:style>
   <w:style w:type="table" w:default="1" w:styleId="TableNormal">

</xml_diff>